<commit_message>
Shorten two-machine guide with tested LAN IPs
</commit_message>
<xml_diff>
--- a/protocol.docx
+++ b/protocol.docx
@@ -7542,9 +7542,15 @@
     <w:p>
       <w:pPr>
         <w:pStyle w:val="Heading1"/>
+        <w:pageBreakBefore/>
       </w:pPr>
       <w:r>
-        <w:t>8. Hướng dẫn biên dịch và chạy</w:t>
+        <w:t>8. Biên dịch và chạy trên hai máy</w:t>
+      </w:r>
+    </w:p>
+    <w:p>
+      <w:r>
+        <w:t>Máy A chạy server tại 192.168.1.3; máy B chạy client tại 192.168.1.5. Hai máy cùng LAN hoặc Wi-Fi. Nếu IP đổi, dùng IPv4 hiện tại của máy server trong lệnh client.</w:t>
       </w:r>
     </w:p>
     <w:p>
@@ -7552,451 +7558,66 @@
         <w:pStyle w:val="Heading2"/>
       </w:pPr>
       <w:r>
-        <w:t>8.1. Môi trường đã kiểm thử</w:t>
+        <w:t>8.1. Biên dịch</w:t>
       </w:r>
     </w:p>
-    <w:tbl>
-      <w:tblPr>
-        <w:tblW w:w="9354" w:type="dxa"/>
-        <w:tblBorders>
-          <w:top w:val="single" w:sz="4" w:space="0" w:color="auto"/>
-          <w:left w:val="single" w:sz="4" w:space="0" w:color="auto"/>
-          <w:bottom w:val="single" w:sz="4" w:space="0" w:color="auto"/>
-          <w:right w:val="single" w:sz="4" w:space="0" w:color="auto"/>
-          <w:insideH w:val="single" w:sz="4" w:space="0" w:color="auto"/>
-          <w:insideV w:val="single" w:sz="4" w:space="0" w:color="auto"/>
-        </w:tblBorders>
-        <w:tblLayout w:type="fixed"/>
-        <w:tblCellMar>
-          <w:left w:w="10" w:type="dxa"/>
-          <w:right w:w="10" w:type="dxa"/>
-        </w:tblCellMar>
-        <w:tblLook w:val="04A0" w:firstRow="1" w:lastRow="0" w:firstColumn="1" w:lastColumn="0" w:noHBand="0" w:noVBand="1"/>
-      </w:tblPr>
-      <w:tblGrid>
-        <w:gridCol w:w="2244"/>
-        <w:gridCol w:w="4677"/>
-        <w:gridCol w:w="2433"/>
-      </w:tblGrid>
-      <w:tr>
-        <w:tblPrEx>
-          <w:tblCellMar>
-            <w:top w:w="0" w:type="dxa"/>
-            <w:bottom w:w="0" w:type="dxa"/>
-          </w:tblCellMar>
-        </w:tblPrEx>
-        <w:trPr>
-          <w:cantSplit/>
-          <w:tblHeader/>
-        </w:trPr>
-        <w:tc>
-          <w:tcPr>
-            <w:tcW w:w="2244" w:type="dxa"/>
-            <w:tcBorders>
-              <w:top w:val="single" w:sz="4" w:space="0" w:color="9E9E9E"/>
-              <w:left w:val="single" w:sz="4" w:space="0" w:color="9E9E9E"/>
-              <w:bottom w:val="single" w:sz="4" w:space="0" w:color="9E9E9E"/>
-              <w:right w:val="single" w:sz="4" w:space="0" w:color="9E9E9E"/>
-            </w:tcBorders>
-            <w:shd w:val="clear" w:color="auto" w:fill="DCE6F2"/>
-            <w:tcMar>
-              <w:top w:w="40" w:type="dxa"/>
-              <w:left w:w="100" w:type="dxa"/>
-              <w:bottom w:w="40" w:type="dxa"/>
-              <w:right w:w="100" w:type="dxa"/>
-            </w:tcMar>
-          </w:tcPr>
-          <w:p>
-            <w:pPr>
-              <w:spacing w:after="20" w:line="252" w:lineRule="auto"/>
-            </w:pPr>
-            <w:r>
-              <w:rPr>
-                <w:b/>
-                <w:bCs/>
-                <w:sz w:val="22"/>
-                <w:szCs w:val="22"/>
-              </w:rPr>
-              <w:t>Hệ điều hành</w:t>
-            </w:r>
-          </w:p>
-        </w:tc>
-        <w:tc>
-          <w:tcPr>
-            <w:tcW w:w="4677" w:type="dxa"/>
-            <w:tcBorders>
-              <w:top w:val="single" w:sz="4" w:space="0" w:color="9E9E9E"/>
-              <w:left w:val="single" w:sz="4" w:space="0" w:color="9E9E9E"/>
-              <w:bottom w:val="single" w:sz="4" w:space="0" w:color="9E9E9E"/>
-              <w:right w:val="single" w:sz="4" w:space="0" w:color="9E9E9E"/>
-            </w:tcBorders>
-            <w:shd w:val="clear" w:color="auto" w:fill="DCE6F2"/>
-            <w:tcMar>
-              <w:top w:w="40" w:type="dxa"/>
-              <w:left w:w="100" w:type="dxa"/>
-              <w:bottom w:w="40" w:type="dxa"/>
-              <w:right w:w="100" w:type="dxa"/>
-            </w:tcMar>
-          </w:tcPr>
-          <w:p>
-            <w:pPr>
-              <w:spacing w:after="20" w:line="252" w:lineRule="auto"/>
-            </w:pPr>
-            <w:r>
-              <w:rPr>
-                <w:b/>
-                <w:bCs/>
-                <w:sz w:val="22"/>
-                <w:szCs w:val="22"/>
-              </w:rPr>
-              <w:t>Trình biên dịch</w:t>
-            </w:r>
-          </w:p>
-        </w:tc>
-        <w:tc>
-          <w:tcPr>
-            <w:tcW w:w="2433" w:type="dxa"/>
-            <w:tcBorders>
-              <w:top w:val="single" w:sz="4" w:space="0" w:color="9E9E9E"/>
-              <w:left w:val="single" w:sz="4" w:space="0" w:color="9E9E9E"/>
-              <w:bottom w:val="single" w:sz="4" w:space="0" w:color="9E9E9E"/>
-              <w:right w:val="single" w:sz="4" w:space="0" w:color="9E9E9E"/>
-            </w:tcBorders>
-            <w:shd w:val="clear" w:color="auto" w:fill="DCE6F2"/>
-            <w:tcMar>
-              <w:top w:w="40" w:type="dxa"/>
-              <w:left w:w="100" w:type="dxa"/>
-              <w:bottom w:w="40" w:type="dxa"/>
-              <w:right w:w="100" w:type="dxa"/>
-            </w:tcMar>
-          </w:tcPr>
-          <w:p>
-            <w:pPr>
-              <w:spacing w:after="20" w:line="252" w:lineRule="auto"/>
-            </w:pPr>
-            <w:r>
-              <w:rPr>
-                <w:b/>
-                <w:bCs/>
-                <w:sz w:val="22"/>
-                <w:szCs w:val="22"/>
-              </w:rPr>
-              <w:t>Kết quả</w:t>
-            </w:r>
-          </w:p>
-        </w:tc>
-      </w:tr>
-      <w:tr>
-        <w:tblPrEx>
-          <w:tblCellMar>
-            <w:top w:w="0" w:type="dxa"/>
-            <w:bottom w:w="0" w:type="dxa"/>
-          </w:tblCellMar>
-        </w:tblPrEx>
-        <w:trPr>
-          <w:cantSplit/>
-        </w:trPr>
-        <w:tc>
-          <w:tcPr>
-            <w:tcW w:w="2244" w:type="dxa"/>
-            <w:tcBorders>
-              <w:top w:val="single" w:sz="4" w:space="0" w:color="9E9E9E"/>
-              <w:left w:val="single" w:sz="4" w:space="0" w:color="9E9E9E"/>
-              <w:bottom w:val="single" w:sz="4" w:space="0" w:color="9E9E9E"/>
-              <w:right w:val="single" w:sz="4" w:space="0" w:color="9E9E9E"/>
-            </w:tcBorders>
-            <w:tcMar>
-              <w:top w:w="40" w:type="dxa"/>
-              <w:left w:w="100" w:type="dxa"/>
-              <w:bottom w:w="40" w:type="dxa"/>
-              <w:right w:w="100" w:type="dxa"/>
-            </w:tcMar>
-          </w:tcPr>
-          <w:p>
-            <w:pPr>
-              <w:spacing w:after="20" w:line="252" w:lineRule="auto"/>
-            </w:pPr>
-            <w:r>
-              <w:rPr>
-                <w:sz w:val="22"/>
-                <w:szCs w:val="22"/>
-              </w:rPr>
-              <w:t>Windows 11</w:t>
-            </w:r>
-          </w:p>
-        </w:tc>
-        <w:tc>
-          <w:tcPr>
-            <w:tcW w:w="4677" w:type="dxa"/>
-            <w:tcBorders>
-              <w:top w:val="single" w:sz="4" w:space="0" w:color="9E9E9E"/>
-              <w:left w:val="single" w:sz="4" w:space="0" w:color="9E9E9E"/>
-              <w:bottom w:val="single" w:sz="4" w:space="0" w:color="9E9E9E"/>
-              <w:right w:val="single" w:sz="4" w:space="0" w:color="9E9E9E"/>
-            </w:tcBorders>
-            <w:tcMar>
-              <w:top w:w="40" w:type="dxa"/>
-              <w:left w:w="100" w:type="dxa"/>
-              <w:bottom w:w="40" w:type="dxa"/>
-              <w:right w:w="100" w:type="dxa"/>
-            </w:tcMar>
-          </w:tcPr>
-          <w:p>
-            <w:pPr>
-              <w:spacing w:after="20" w:line="252" w:lineRule="auto"/>
-            </w:pPr>
-            <w:r>
-              <w:rPr>
-                <w:sz w:val="22"/>
-                <w:szCs w:val="22"/>
-              </w:rPr>
-              <w:t>MinGW.org GCC 6.3.0 (bản cũ, thường đi kèm Dev-C++ / Code::Blocks)</w:t>
-            </w:r>
-          </w:p>
-        </w:tc>
-        <w:tc>
-          <w:tcPr>
-            <w:tcW w:w="2433" w:type="dxa"/>
-            <w:tcBorders>
-              <w:top w:val="single" w:sz="4" w:space="0" w:color="9E9E9E"/>
-              <w:left w:val="single" w:sz="4" w:space="0" w:color="9E9E9E"/>
-              <w:bottom w:val="single" w:sz="4" w:space="0" w:color="9E9E9E"/>
-              <w:right w:val="single" w:sz="4" w:space="0" w:color="9E9E9E"/>
-            </w:tcBorders>
-            <w:tcMar>
-              <w:top w:w="40" w:type="dxa"/>
-              <w:left w:w="100" w:type="dxa"/>
-              <w:bottom w:w="40" w:type="dxa"/>
-              <w:right w:w="100" w:type="dxa"/>
-            </w:tcMar>
-          </w:tcPr>
-          <w:p>
-            <w:pPr>
-              <w:spacing w:after="20" w:line="252" w:lineRule="auto"/>
-            </w:pPr>
-            <w:r>
-              <w:rPr>
-                <w:sz w:val="22"/>
-                <w:szCs w:val="22"/>
-              </w:rPr>
-              <w:t>Biên dịch và chạy đúng</w:t>
-            </w:r>
-          </w:p>
-        </w:tc>
-      </w:tr>
-      <w:tr>
-        <w:tblPrEx>
-          <w:tblCellMar>
-            <w:top w:w="0" w:type="dxa"/>
-            <w:bottom w:w="0" w:type="dxa"/>
-          </w:tblCellMar>
-        </w:tblPrEx>
-        <w:trPr>
-          <w:cantSplit/>
-        </w:trPr>
-        <w:tc>
-          <w:tcPr>
-            <w:tcW w:w="2244" w:type="dxa"/>
-            <w:tcBorders>
-              <w:top w:val="single" w:sz="4" w:space="0" w:color="9E9E9E"/>
-              <w:left w:val="single" w:sz="4" w:space="0" w:color="9E9E9E"/>
-              <w:bottom w:val="single" w:sz="4" w:space="0" w:color="9E9E9E"/>
-              <w:right w:val="single" w:sz="4" w:space="0" w:color="9E9E9E"/>
-            </w:tcBorders>
-            <w:tcMar>
-              <w:top w:w="40" w:type="dxa"/>
-              <w:left w:w="100" w:type="dxa"/>
-              <w:bottom w:w="40" w:type="dxa"/>
-              <w:right w:w="100" w:type="dxa"/>
-            </w:tcMar>
-          </w:tcPr>
-          <w:p>
-            <w:pPr>
-              <w:spacing w:after="20" w:line="252" w:lineRule="auto"/>
-            </w:pPr>
-            <w:r>
-              <w:rPr>
-                <w:sz w:val="22"/>
-                <w:szCs w:val="22"/>
-              </w:rPr>
-              <w:t>Windows 11</w:t>
-            </w:r>
-          </w:p>
-        </w:tc>
-        <w:tc>
-          <w:tcPr>
-            <w:tcW w:w="4677" w:type="dxa"/>
-            <w:tcBorders>
-              <w:top w:val="single" w:sz="4" w:space="0" w:color="9E9E9E"/>
-              <w:left w:val="single" w:sz="4" w:space="0" w:color="9E9E9E"/>
-              <w:bottom w:val="single" w:sz="4" w:space="0" w:color="9E9E9E"/>
-              <w:right w:val="single" w:sz="4" w:space="0" w:color="9E9E9E"/>
-            </w:tcBorders>
-            <w:tcMar>
-              <w:top w:w="40" w:type="dxa"/>
-              <w:left w:w="100" w:type="dxa"/>
-              <w:bottom w:w="40" w:type="dxa"/>
-              <w:right w:w="100" w:type="dxa"/>
-            </w:tcMar>
-          </w:tcPr>
-          <w:p>
-            <w:pPr>
-              <w:spacing w:after="20" w:line="252" w:lineRule="auto"/>
-            </w:pPr>
-            <w:r>
-              <w:rPr>
-                <w:sz w:val="22"/>
-                <w:szCs w:val="22"/>
-              </w:rPr>
-              <w:t>MinGW-w64 GCC 16.2 (MSYS2, môi trường UCRT64)</w:t>
-            </w:r>
-          </w:p>
-        </w:tc>
-        <w:tc>
-          <w:tcPr>
-            <w:tcW w:w="2433" w:type="dxa"/>
-            <w:tcBorders>
-              <w:top w:val="single" w:sz="4" w:space="0" w:color="9E9E9E"/>
-              <w:left w:val="single" w:sz="4" w:space="0" w:color="9E9E9E"/>
-              <w:bottom w:val="single" w:sz="4" w:space="0" w:color="9E9E9E"/>
-              <w:right w:val="single" w:sz="4" w:space="0" w:color="9E9E9E"/>
-            </w:tcBorders>
-            <w:tcMar>
-              <w:top w:w="40" w:type="dxa"/>
-              <w:left w:w="100" w:type="dxa"/>
-              <w:bottom w:w="40" w:type="dxa"/>
-              <w:right w:w="100" w:type="dxa"/>
-            </w:tcMar>
-          </w:tcPr>
-          <w:p>
-            <w:pPr>
-              <w:spacing w:after="20" w:line="252" w:lineRule="auto"/>
-            </w:pPr>
-            <w:r>
-              <w:rPr>
-                <w:sz w:val="22"/>
-                <w:szCs w:val="22"/>
-              </w:rPr>
-              <w:t>Biên dịch và chạy đúng</w:t>
-            </w:r>
-          </w:p>
-        </w:tc>
-      </w:tr>
-      <w:tr>
-        <w:tblPrEx>
-          <w:tblCellMar>
-            <w:top w:w="0" w:type="dxa"/>
-            <w:bottom w:w="0" w:type="dxa"/>
-          </w:tblCellMar>
-        </w:tblPrEx>
-        <w:trPr>
-          <w:cantSplit/>
-        </w:trPr>
-        <w:tc>
-          <w:tcPr>
-            <w:tcW w:w="2244" w:type="dxa"/>
-            <w:tcBorders>
-              <w:top w:val="single" w:sz="4" w:space="0" w:color="9E9E9E"/>
-              <w:left w:val="single" w:sz="4" w:space="0" w:color="9E9E9E"/>
-              <w:bottom w:val="single" w:sz="4" w:space="0" w:color="9E9E9E"/>
-              <w:right w:val="single" w:sz="4" w:space="0" w:color="9E9E9E"/>
-            </w:tcBorders>
-            <w:tcMar>
-              <w:top w:w="40" w:type="dxa"/>
-              <w:left w:w="100" w:type="dxa"/>
-              <w:bottom w:w="40" w:type="dxa"/>
-              <w:right w:w="100" w:type="dxa"/>
-            </w:tcMar>
-          </w:tcPr>
-          <w:p>
-            <w:pPr>
-              <w:spacing w:after="20" w:line="252" w:lineRule="auto"/>
-            </w:pPr>
-            <w:r>
-              <w:rPr>
-                <w:sz w:val="22"/>
-                <w:szCs w:val="22"/>
-              </w:rPr>
-              <w:t>Ubuntu 24.04 (WSL)</w:t>
-            </w:r>
-          </w:p>
-        </w:tc>
-        <w:tc>
-          <w:tcPr>
-            <w:tcW w:w="4677" w:type="dxa"/>
-            <w:tcBorders>
-              <w:top w:val="single" w:sz="4" w:space="0" w:color="9E9E9E"/>
-              <w:left w:val="single" w:sz="4" w:space="0" w:color="9E9E9E"/>
-              <w:bottom w:val="single" w:sz="4" w:space="0" w:color="9E9E9E"/>
-              <w:right w:val="single" w:sz="4" w:space="0" w:color="9E9E9E"/>
-            </w:tcBorders>
-            <w:tcMar>
-              <w:top w:w="40" w:type="dxa"/>
-              <w:left w:w="100" w:type="dxa"/>
-              <w:bottom w:w="40" w:type="dxa"/>
-              <w:right w:w="100" w:type="dxa"/>
-            </w:tcMar>
-          </w:tcPr>
-          <w:p>
-            <w:pPr>
-              <w:spacing w:after="20" w:line="252" w:lineRule="auto"/>
-            </w:pPr>
-            <w:r>
-              <w:rPr>
-                <w:sz w:val="22"/>
-                <w:szCs w:val="22"/>
-              </w:rPr>
-              <w:t>GCC 13.3</w:t>
-            </w:r>
-          </w:p>
-        </w:tc>
-        <w:tc>
-          <w:tcPr>
-            <w:tcW w:w="2433" w:type="dxa"/>
-            <w:tcBorders>
-              <w:top w:val="single" w:sz="4" w:space="0" w:color="9E9E9E"/>
-              <w:left w:val="single" w:sz="4" w:space="0" w:color="9E9E9E"/>
-              <w:bottom w:val="single" w:sz="4" w:space="0" w:color="9E9E9E"/>
-              <w:right w:val="single" w:sz="4" w:space="0" w:color="9E9E9E"/>
-            </w:tcBorders>
-            <w:tcMar>
-              <w:top w:w="40" w:type="dxa"/>
-              <w:left w:w="100" w:type="dxa"/>
-              <w:bottom w:w="40" w:type="dxa"/>
-              <w:right w:w="100" w:type="dxa"/>
-            </w:tcMar>
-          </w:tcPr>
-          <w:p>
-            <w:pPr>
-              <w:spacing w:after="20" w:line="252" w:lineRule="auto"/>
-            </w:pPr>
-            <w:r>
-              <w:rPr>
-                <w:sz w:val="22"/>
-                <w:szCs w:val="22"/>
-              </w:rPr>
-              <w:t>Biên dịch và chạy đúng</w:t>
-            </w:r>
-          </w:p>
-        </w:tc>
-      </w:tr>
-    </w:tbl>
     <w:p>
-      <w:pPr>
-        <w:spacing w:after="100"/>
-      </w:pPr>
+      <w:r>
+        <w:t>Kiểm tra g++ --version. MSYS2 không bắt buộc; đó chỉ là một cách cài g++ trên Windows. Mở terminal tại thư mục chứa mã nguồn và chạy lệnh phù hợp:</w:t>
+      </w:r>
+    </w:p>
+    <w:p>
+      <w:r>
+        <w:t>Windows (PowerShell):</w:t>
+      </w:r>
     </w:p>
     <w:p>
       <w:pPr>
-        <w:spacing w:after="100" w:line="276" w:lineRule="auto"/>
-        <w:jc w:val="both"/>
+        <w:shd w:fill="F2F2F2"/>
       </w:pPr>
       <w:r>
-        <w:t xml:space="preserve">Mã nguồn dùng C++11. Đã biên dịch và chạy bộ kiểm thử 55 trường hợp trên Windows 11 với MinGW.org GCC 6.3.0. Đã biên dịch bằng GCC 13.3 trên Ubuntu 24.04 trong WSL và chạy kết nối hai chiều Windows ↔ WSL qua hai địa chỉ IP riêng. WSL vẫn chạy trên cùng một máy vật lý; </w:t>
-      </w:r>
-      <w:r>
-        <w:lastRenderedPageBreak/>
-        <w:t>nhóm cần chạy thêm với hai máy thật và chụp màn hình nếu muốn chứng minh kịch bản hai bạn cùng mạng. Visual Studio không bắt buộc: mã có hỗ trợ MSVC nhưng chưa kiểm thử bằng MSVC.</w:t>
+        <w:rPr>
+          <w:rFonts w:ascii="Consolas" w:hAnsi="Consolas"/>
+          <w:sz w:val="18"/>
+        </w:rPr>
+        <w:t>g++ -std=c++11 server.cpp -o server.exe -lws2_32</w:t>
+      </w:r>
+      <w:r>
+        <w:br/>
+      </w:r>
+      <w:r>
+        <w:rPr>
+          <w:rFonts w:ascii="Consolas" w:hAnsi="Consolas"/>
+          <w:sz w:val="18"/>
+        </w:rPr>
+        <w:t>g++ -std=c++11 client.cpp -o client.exe -lws2_32</w:t>
+      </w:r>
+    </w:p>
+    <w:p>
+      <w:r>
+        <w:t>Linux:</w:t>
+      </w:r>
+    </w:p>
+    <w:p>
+      <w:pPr>
+        <w:shd w:fill="F2F2F2"/>
+      </w:pPr>
+      <w:r>
+        <w:rPr>
+          <w:rFonts w:ascii="Consolas" w:hAnsi="Consolas"/>
+          <w:sz w:val="18"/>
+        </w:rPr>
+        <w:t>g++ -std=c++11 server.cpp -o server</w:t>
+      </w:r>
+      <w:r>
+        <w:br/>
+      </w:r>
+      <w:r>
+        <w:rPr>
+          <w:rFonts w:ascii="Consolas" w:hAnsi="Consolas"/>
+          <w:sz w:val="18"/>
+        </w:rPr>
+        <w:t>g++ -std=c++11 client.cpp -o client</w:t>
       </w:r>
     </w:p>
     <w:p>
@@ -8004,1586 +7625,82 @@
         <w:pStyle w:val="Heading2"/>
       </w:pPr>
       <w:r>
-        <w:t>8.2. Biên dịch</w:t>
+        <w:t>8.2. Chạy trên hai máy</w:t>
+      </w:r>
+    </w:p>
+    <w:p>
+      <w:r>
+        <w:t>Máy A (server, 192.168.1.3): kiểm tra IPv4 bằng ipconfig (Windows) hoặc ip -4 addr (Linux), rồi giữ terminal server mở:</w:t>
       </w:r>
     </w:p>
     <w:p>
       <w:pPr>
-        <w:keepNext/>
-        <w:spacing w:after="100" w:line="276" w:lineRule="auto"/>
+        <w:shd w:fill="F2F2F2"/>
       </w:pPr>
       <w:r>
-        <w:t>Windows: trước tiên chạy g++ --version và where.exe g++ trong PowerShell. Cần g++ (trình biên dịch C++); chỉ có lệnh gcc chưa chứng minh đã có g++. Nếu g++ đã chạy được, mở PowerShell tại thư mục chứa hai tệp .cpp rồi dùng các lệnh sau:</w:t>
+        <w:rPr>
+          <w:rFonts w:ascii="Consolas" w:hAnsi="Consolas"/>
+          <w:sz w:val="18"/>
+        </w:rPr>
+        <w:t>.\server.exe 8080          # Windows</w:t>
+      </w:r>
+      <w:r>
+        <w:br/>
+      </w:r>
+      <w:r>
+        <w:rPr>
+          <w:rFonts w:ascii="Consolas" w:hAnsi="Consolas"/>
+          <w:sz w:val="18"/>
+        </w:rPr>
+        <w:t>./server 8080               # Linux</w:t>
+      </w:r>
+    </w:p>
+    <w:p>
+      <w:r>
+        <w:t>Máy B (client, 192.168.1.5): thay &lt;IP_SERVER&gt; bằng IPv4 của máy A:</w:t>
       </w:r>
     </w:p>
     <w:p>
       <w:pPr>
-        <w:keepNext/>
-        <w:keepLines/>
-        <w:shd w:val="clear" w:color="auto" w:fill="F2F2F2"/>
-        <w:spacing w:before="60"/>
-        <w:ind w:left="142" w:right="142"/>
+        <w:shd w:fill="F2F2F2"/>
       </w:pPr>
       <w:r>
         <w:rPr>
-          <w:rFonts w:ascii="Consolas" w:eastAsia="Consolas" w:hAnsi="Consolas" w:cs="Consolas"/>
+          <w:rFonts w:ascii="Consolas" w:hAnsi="Consolas"/>
           <w:sz w:val="18"/>
-          <w:szCs w:val="18"/>
         </w:rPr>
-        <w:t>g++ -std=c++11 server.cpp -o server.exe -lws2_32</w:t>
+        <w:t>.\client.exe &lt;IP_SERVER&gt; 8080</w:t>
+      </w:r>
+      <w:r>
+        <w:br/>
+      </w:r>
+      <w:r>
+        <w:rPr>
+          <w:rFonts w:ascii="Consolas" w:hAnsi="Consolas"/>
+          <w:sz w:val="18"/>
+        </w:rPr>
+        <w:t>.\client.exe 192.168.1.3 8080   # ví dụ Windows</w:t>
+      </w:r>
+      <w:r>
+        <w:br/>
+      </w:r>
+      <w:r>
+        <w:rPr>
+          <w:rFonts w:ascii="Consolas" w:hAnsi="Consolas"/>
+          <w:sz w:val="18"/>
+        </w:rPr>
+        <w:t>./client 192.168.1.3 8080       # ví dụ Linux</w:t>
       </w:r>
     </w:p>
     <w:p>
-      <w:pPr>
-        <w:keepLines/>
-        <w:shd w:val="clear" w:color="auto" w:fill="F2F2F2"/>
-        <w:spacing w:after="180"/>
-        <w:ind w:left="142" w:right="142"/>
-      </w:pPr>
-      <w:r>
-        <w:rPr>
-          <w:rFonts w:ascii="Consolas" w:eastAsia="Consolas" w:hAnsi="Consolas" w:cs="Consolas"/>
-          <w:sz w:val="18"/>
-          <w:szCs w:val="18"/>
-        </w:rPr>
-        <w:t>g++ -std=c++11 client.cpp -o client.exe -lws2_32</w:t>
+      <w:r>
+        <w:t>Thử kết quả SAI: chạy .\client.exe 192.168.1.3 8080 -m và nhập một tổng sai. Có thể đổi 8080 thành port khác, ví dụ 9090, ở cả hai máy. Cho phép kết nối TCP vào port đó trên firewall máy A.</w:t>
       </w:r>
     </w:p>
     <w:p>
       <w:r>
-        <w:t>Máy Windows chỉ cần CHẠY để demo: copy client.exe hoặc server.exe từ thư mục demo-windows đi kèm bên ngoài zip nộp. Hai bản này đã được liên kết tĩnh, kiểm tra chỉ cần DLL hệ thống Windows và chạy đạt 50/50 ca kiểm thử với PATH không có MinGW/MSYS2. Không cần cài compiler trên máy chỉ chạy .exe. Thư mục demo-windows dùng cho buổi thử, không nằm trong zip bốn tệp nộp.</w:t>
-      </w:r>
-    </w:p>
-    <w:p>
-      <w:r>
-        <w:t>MSYS2 không bắt buộc. Nếu Windows chưa có g++ và cần tự biên dịch từ mã nguồn, MSYS2 UCRT64 là một cách cài GCC/g++: tải tại https://www.msys2.org/, mở cửa sổ UCRT64, chạy pacman -Syu (mở lại UCRT64 nếu được yêu cầu), rồi chạy pacman -S mingw-w64-ucrt-x86_64-gcc. Kiểm tra bằng g++ --version. Nếu máy đã có g++ dùng được, hoặc chỉ chạy bản .exe trong demo-windows, không cần cài MSYS2. Cửa sổ shell chỉ là nơi nhập lệnh; gcc/g++ mới là trình biên dịch.</w:t>
-      </w:r>
-    </w:p>
-    <w:p>
-      <w:pPr>
-        <w:spacing w:after="100" w:line="276" w:lineRule="auto"/>
-        <w:jc w:val="both"/>
-      </w:pPr>
-      <w:r>
-        <w:t xml:space="preserve">Tham số </w:t>
-      </w:r>
-      <w:r>
-        <w:rPr>
-          <w:rFonts w:ascii="Consolas" w:eastAsia="Consolas" w:hAnsi="Consolas" w:cs="Consolas"/>
-          <w:sz w:val="21"/>
-          <w:szCs w:val="21"/>
-        </w:rPr>
-        <w:t>-lws2_32</w:t>
-      </w:r>
-      <w:r>
-        <w:t xml:space="preserve"> là bắt buộc khi dùng g++ trên Windows vì nó liên kết thư viện Winsock. Thiếu tham số này, g++ báo lỗi “undefined reference to WSAStartup”.</w:t>
-      </w:r>
-    </w:p>
-    <w:p>
-      <w:pPr>
-        <w:keepNext/>
-        <w:spacing w:after="100" w:line="276" w:lineRule="auto"/>
-      </w:pPr>
-      <w:r>
-        <w:rPr>
-          <w:b/>
-          <w:bCs/>
-        </w:rPr>
-        <w:t>Linux:</w:t>
-      </w:r>
-    </w:p>
-    <w:p>
-      <w:r>
-        <w:t>Trên Ubuntu: kiểm tra g++ --version. Nếu báo chưa có lệnh, chạy sudo apt update rồi sudo apt install g++. Sau đó mở terminal tại thư mục chứa mã nguồn và dùng hai lệnh dưới đây. Không thể chạy file .exe Windows trên Linux như một chương trình Linux thông thường; Linux phải biên dịch từ .cpp.</w:t>
-      </w:r>
-    </w:p>
-    <w:p>
-      <w:pPr>
-        <w:keepNext/>
-        <w:keepLines/>
-        <w:shd w:val="clear" w:color="auto" w:fill="F2F2F2"/>
-        <w:spacing w:before="60"/>
-        <w:ind w:left="142" w:right="142"/>
-      </w:pPr>
-      <w:r>
-        <w:rPr>
-          <w:rFonts w:ascii="Consolas" w:eastAsia="Consolas" w:hAnsi="Consolas" w:cs="Consolas"/>
-          <w:sz w:val="18"/>
-          <w:szCs w:val="18"/>
-        </w:rPr>
-        <w:t>g++ -std=c++11 server.cpp -o server</w:t>
-      </w:r>
-    </w:p>
-    <w:p>
-      <w:pPr>
-        <w:keepLines/>
-        <w:shd w:val="clear" w:color="auto" w:fill="F2F2F2"/>
-        <w:spacing w:after="180"/>
-        <w:ind w:left="142" w:right="142"/>
-      </w:pPr>
-      <w:r>
-        <w:rPr>
-          <w:rFonts w:ascii="Consolas" w:eastAsia="Consolas" w:hAnsi="Consolas" w:cs="Consolas"/>
-          <w:sz w:val="18"/>
-          <w:szCs w:val="18"/>
-        </w:rPr>
-        <w:t>g++ -std=c++11 client.cpp -o client</w:t>
-      </w:r>
-    </w:p>
-    <w:p>
-      <w:pPr>
-        <w:pStyle w:val="Heading2"/>
-      </w:pPr>
-      <w:r>
-        <w:t>8.3. Cách chạy</w:t>
-      </w:r>
-    </w:p>
-    <w:tbl>
-      <w:tblPr>
-        <w:tblW w:w="9354" w:type="dxa"/>
-        <w:tblBorders>
-          <w:top w:val="single" w:sz="4" w:space="0" w:color="auto"/>
-          <w:left w:val="single" w:sz="4" w:space="0" w:color="auto"/>
-          <w:bottom w:val="single" w:sz="4" w:space="0" w:color="auto"/>
-          <w:right w:val="single" w:sz="4" w:space="0" w:color="auto"/>
-          <w:insideH w:val="single" w:sz="4" w:space="0" w:color="auto"/>
-          <w:insideV w:val="single" w:sz="4" w:space="0" w:color="auto"/>
-        </w:tblBorders>
-        <w:tblLayout w:type="fixed"/>
-        <w:tblCellMar>
-          <w:left w:w="10" w:type="dxa"/>
-          <w:right w:w="10" w:type="dxa"/>
-        </w:tblCellMar>
-        <w:tblLook w:val="04A0" w:firstRow="1" w:lastRow="0" w:firstColumn="1" w:lastColumn="0" w:noHBand="0" w:noVBand="1"/>
-      </w:tblPr>
-      <w:tblGrid>
-        <w:gridCol w:w="3367"/>
-        <w:gridCol w:w="5987"/>
-      </w:tblGrid>
-      <w:tr>
-        <w:tblPrEx>
-          <w:tblCellMar>
-            <w:top w:w="0" w:type="dxa"/>
-            <w:bottom w:w="0" w:type="dxa"/>
-          </w:tblCellMar>
-        </w:tblPrEx>
-        <w:trPr>
-          <w:cantSplit/>
-          <w:tblHeader/>
-        </w:trPr>
-        <w:tc>
-          <w:tcPr>
-            <w:tcW w:w="3367" w:type="dxa"/>
-            <w:tcBorders>
-              <w:top w:val="single" w:sz="4" w:space="0" w:color="9E9E9E"/>
-              <w:left w:val="single" w:sz="4" w:space="0" w:color="9E9E9E"/>
-              <w:bottom w:val="single" w:sz="4" w:space="0" w:color="9E9E9E"/>
-              <w:right w:val="single" w:sz="4" w:space="0" w:color="9E9E9E"/>
-            </w:tcBorders>
-            <w:shd w:val="clear" w:color="auto" w:fill="DCE6F2"/>
-            <w:tcMar>
-              <w:top w:w="40" w:type="dxa"/>
-              <w:left w:w="100" w:type="dxa"/>
-              <w:bottom w:w="40" w:type="dxa"/>
-              <w:right w:w="100" w:type="dxa"/>
-            </w:tcMar>
-          </w:tcPr>
-          <w:p>
-            <w:pPr>
-              <w:spacing w:after="20" w:line="252" w:lineRule="auto"/>
-            </w:pPr>
-            <w:r>
-              <w:rPr>
-                <w:b/>
-                <w:bCs/>
-                <w:sz w:val="22"/>
-                <w:szCs w:val="22"/>
-              </w:rPr>
-              <w:t>Lệnh</w:t>
-            </w:r>
-          </w:p>
-        </w:tc>
-        <w:tc>
-          <w:tcPr>
-            <w:tcW w:w="5987" w:type="dxa"/>
-            <w:tcBorders>
-              <w:top w:val="single" w:sz="4" w:space="0" w:color="9E9E9E"/>
-              <w:left w:val="single" w:sz="4" w:space="0" w:color="9E9E9E"/>
-              <w:bottom w:val="single" w:sz="4" w:space="0" w:color="9E9E9E"/>
-              <w:right w:val="single" w:sz="4" w:space="0" w:color="9E9E9E"/>
-            </w:tcBorders>
-            <w:shd w:val="clear" w:color="auto" w:fill="DCE6F2"/>
-            <w:tcMar>
-              <w:top w:w="40" w:type="dxa"/>
-              <w:left w:w="100" w:type="dxa"/>
-              <w:bottom w:w="40" w:type="dxa"/>
-              <w:right w:w="100" w:type="dxa"/>
-            </w:tcMar>
-          </w:tcPr>
-          <w:p>
-            <w:pPr>
-              <w:spacing w:after="20" w:line="252" w:lineRule="auto"/>
-            </w:pPr>
-            <w:r>
-              <w:rPr>
-                <w:b/>
-                <w:bCs/>
-                <w:sz w:val="22"/>
-                <w:szCs w:val="22"/>
-              </w:rPr>
-              <w:t>Ý nghĩa</w:t>
-            </w:r>
-          </w:p>
-        </w:tc>
-      </w:tr>
-      <w:tr>
-        <w:tblPrEx>
-          <w:tblCellMar>
-            <w:top w:w="0" w:type="dxa"/>
-            <w:bottom w:w="0" w:type="dxa"/>
-          </w:tblCellMar>
-        </w:tblPrEx>
-        <w:trPr>
-          <w:cantSplit/>
-        </w:trPr>
-        <w:tc>
-          <w:tcPr>
-            <w:tcW w:w="3367" w:type="dxa"/>
-            <w:tcBorders>
-              <w:top w:val="single" w:sz="4" w:space="0" w:color="9E9E9E"/>
-              <w:left w:val="single" w:sz="4" w:space="0" w:color="9E9E9E"/>
-              <w:bottom w:val="single" w:sz="4" w:space="0" w:color="9E9E9E"/>
-              <w:right w:val="single" w:sz="4" w:space="0" w:color="9E9E9E"/>
-            </w:tcBorders>
-            <w:tcMar>
-              <w:top w:w="40" w:type="dxa"/>
-              <w:left w:w="100" w:type="dxa"/>
-              <w:bottom w:w="40" w:type="dxa"/>
-              <w:right w:w="100" w:type="dxa"/>
-            </w:tcMar>
-          </w:tcPr>
-          <w:p>
-            <w:pPr>
-              <w:spacing w:after="20" w:line="252" w:lineRule="auto"/>
-            </w:pPr>
-            <w:r>
-              <w:rPr>
-                <w:rFonts w:ascii="Consolas" w:eastAsia="Consolas" w:hAnsi="Consolas" w:cs="Consolas"/>
-                <w:sz w:val="19"/>
-                <w:szCs w:val="19"/>
-              </w:rPr>
-              <w:t>server [port]</w:t>
-            </w:r>
-          </w:p>
-        </w:tc>
-        <w:tc>
-          <w:tcPr>
-            <w:tcW w:w="5987" w:type="dxa"/>
-            <w:tcBorders>
-              <w:top w:val="single" w:sz="4" w:space="0" w:color="9E9E9E"/>
-              <w:left w:val="single" w:sz="4" w:space="0" w:color="9E9E9E"/>
-              <w:bottom w:val="single" w:sz="4" w:space="0" w:color="9E9E9E"/>
-              <w:right w:val="single" w:sz="4" w:space="0" w:color="9E9E9E"/>
-            </w:tcBorders>
-            <w:tcMar>
-              <w:top w:w="40" w:type="dxa"/>
-              <w:left w:w="100" w:type="dxa"/>
-              <w:bottom w:w="40" w:type="dxa"/>
-              <w:right w:w="100" w:type="dxa"/>
-            </w:tcMar>
-          </w:tcPr>
-          <w:p>
-            <w:pPr>
-              <w:spacing w:after="20" w:line="252" w:lineRule="auto"/>
-            </w:pPr>
-            <w:r>
-              <w:rPr>
-                <w:sz w:val="22"/>
-                <w:szCs w:val="22"/>
-              </w:rPr>
-              <w:t>Chạy server. Port mặc định 8080.</w:t>
-            </w:r>
-          </w:p>
-        </w:tc>
-      </w:tr>
-      <w:tr>
-        <w:tblPrEx>
-          <w:tblCellMar>
-            <w:top w:w="0" w:type="dxa"/>
-            <w:bottom w:w="0" w:type="dxa"/>
-          </w:tblCellMar>
-        </w:tblPrEx>
-        <w:trPr>
-          <w:cantSplit/>
-        </w:trPr>
-        <w:tc>
-          <w:tcPr>
-            <w:tcW w:w="3367" w:type="dxa"/>
-            <w:tcBorders>
-              <w:top w:val="single" w:sz="4" w:space="0" w:color="9E9E9E"/>
-              <w:left w:val="single" w:sz="4" w:space="0" w:color="9E9E9E"/>
-              <w:bottom w:val="single" w:sz="4" w:space="0" w:color="9E9E9E"/>
-              <w:right w:val="single" w:sz="4" w:space="0" w:color="9E9E9E"/>
-            </w:tcBorders>
-            <w:tcMar>
-              <w:top w:w="40" w:type="dxa"/>
-              <w:left w:w="100" w:type="dxa"/>
-              <w:bottom w:w="40" w:type="dxa"/>
-              <w:right w:w="100" w:type="dxa"/>
-            </w:tcMar>
-          </w:tcPr>
-          <w:p>
-            <w:pPr>
-              <w:spacing w:after="20" w:line="252" w:lineRule="auto"/>
-            </w:pPr>
-            <w:r>
-              <w:rPr>
-                <w:rFonts w:ascii="Consolas" w:eastAsia="Consolas" w:hAnsi="Consolas" w:cs="Consolas"/>
-                <w:sz w:val="19"/>
-                <w:szCs w:val="19"/>
-              </w:rPr>
-              <w:t>client [địa_chỉ] [port] [-m]</w:t>
-            </w:r>
-          </w:p>
-        </w:tc>
-        <w:tc>
-          <w:tcPr>
-            <w:tcW w:w="5987" w:type="dxa"/>
-            <w:tcBorders>
-              <w:top w:val="single" w:sz="4" w:space="0" w:color="9E9E9E"/>
-              <w:left w:val="single" w:sz="4" w:space="0" w:color="9E9E9E"/>
-              <w:bottom w:val="single" w:sz="4" w:space="0" w:color="9E9E9E"/>
-              <w:right w:val="single" w:sz="4" w:space="0" w:color="9E9E9E"/>
-            </w:tcBorders>
-            <w:tcMar>
-              <w:top w:w="40" w:type="dxa"/>
-              <w:left w:w="100" w:type="dxa"/>
-              <w:bottom w:w="40" w:type="dxa"/>
-              <w:right w:w="100" w:type="dxa"/>
-            </w:tcMar>
-          </w:tcPr>
-          <w:p>
-            <w:pPr>
-              <w:spacing w:after="20" w:line="252" w:lineRule="auto"/>
-            </w:pPr>
-            <w:r>
-              <w:rPr>
-                <w:sz w:val="22"/>
-                <w:szCs w:val="22"/>
-              </w:rPr>
-              <w:t>Kết nối tới server; mặc định 127.0.0.1 và 8080. Địa chỉ có thể là IPv4 (ví dụ 192.168.1.15) hoặc tên máy (ví dụ localhost).</w:t>
-            </w:r>
-          </w:p>
-        </w:tc>
-      </w:tr>
-      <w:tr>
-        <w:tblPrEx>
-          <w:tblCellMar>
-            <w:top w:w="0" w:type="dxa"/>
-            <w:bottom w:w="0" w:type="dxa"/>
-          </w:tblCellMar>
-        </w:tblPrEx>
-        <w:trPr>
-          <w:cantSplit/>
-        </w:trPr>
-        <w:tc>
-          <w:tcPr>
-            <w:tcW w:w="3367" w:type="dxa"/>
-            <w:tcBorders>
-              <w:top w:val="single" w:sz="4" w:space="0" w:color="9E9E9E"/>
-              <w:left w:val="single" w:sz="4" w:space="0" w:color="9E9E9E"/>
-              <w:bottom w:val="single" w:sz="4" w:space="0" w:color="9E9E9E"/>
-              <w:right w:val="single" w:sz="4" w:space="0" w:color="9E9E9E"/>
-            </w:tcBorders>
-            <w:tcMar>
-              <w:top w:w="40" w:type="dxa"/>
-              <w:left w:w="100" w:type="dxa"/>
-              <w:bottom w:w="40" w:type="dxa"/>
-              <w:right w:w="100" w:type="dxa"/>
-            </w:tcMar>
-          </w:tcPr>
-          <w:p>
-            <w:pPr>
-              <w:spacing w:after="20" w:line="252" w:lineRule="auto"/>
-            </w:pPr>
-            <w:r>
-              <w:rPr>
-                <w:rFonts w:ascii="Consolas" w:eastAsia="Consolas" w:hAnsi="Consolas" w:cs="Consolas"/>
-                <w:sz w:val="19"/>
-                <w:szCs w:val="19"/>
-              </w:rPr>
-              <w:t>-m</w:t>
-            </w:r>
-          </w:p>
-        </w:tc>
-        <w:tc>
-          <w:tcPr>
-            <w:tcW w:w="5987" w:type="dxa"/>
-            <w:tcBorders>
-              <w:top w:val="single" w:sz="4" w:space="0" w:color="9E9E9E"/>
-              <w:left w:val="single" w:sz="4" w:space="0" w:color="9E9E9E"/>
-              <w:bottom w:val="single" w:sz="4" w:space="0" w:color="9E9E9E"/>
-              <w:right w:val="single" w:sz="4" w:space="0" w:color="9E9E9E"/>
-            </w:tcBorders>
-            <w:tcMar>
-              <w:top w:w="40" w:type="dxa"/>
-              <w:left w:w="100" w:type="dxa"/>
-              <w:bottom w:w="40" w:type="dxa"/>
-              <w:right w:w="100" w:type="dxa"/>
-            </w:tcMar>
-          </w:tcPr>
-          <w:p>
-            <w:pPr>
-              <w:spacing w:after="20" w:line="252" w:lineRule="auto"/>
-            </w:pPr>
-            <w:r>
-              <w:rPr>
-                <w:sz w:val="22"/>
-                <w:szCs w:val="22"/>
-              </w:rPr>
-              <w:t>Người dùng tự nhập tổng thay vì để chương trình tính, dùng để thử trường hợp SAI. Phải nhập trong vòng 60 giây.</w:t>
-            </w:r>
-          </w:p>
-        </w:tc>
-      </w:tr>
-    </w:tbl>
-    <w:p>
-      <w:pPr>
-        <w:spacing w:after="100"/>
-      </w:pPr>
-    </w:p>
-    <w:p>
-      <w:pPr>
-        <w:spacing w:after="100" w:line="276" w:lineRule="auto"/>
-        <w:jc w:val="both"/>
-      </w:pPr>
-      <w:r>
-        <w:t xml:space="preserve">Port phải là số từ 1 đến 65 535. Nếu tham số sai, chương trình in hướng dẫn sử dụng rồi thoát. Trong PowerShell gõ </w:t>
-      </w:r>
-      <w:r>
-        <w:rPr>
-          <w:rFonts w:ascii="Consolas" w:eastAsia="Consolas" w:hAnsi="Consolas" w:cs="Consolas"/>
-          <w:sz w:val="21"/>
-          <w:szCs w:val="21"/>
-        </w:rPr>
-        <w:t>.\server.exe</w:t>
-      </w:r>
-      <w:r>
-        <w:t xml:space="preserve">, trong CMD gõ </w:t>
-      </w:r>
-      <w:r>
-        <w:rPr>
-          <w:rFonts w:ascii="Consolas" w:eastAsia="Consolas" w:hAnsi="Consolas" w:cs="Consolas"/>
-          <w:sz w:val="21"/>
-          <w:szCs w:val="21"/>
-        </w:rPr>
-        <w:t>server.exe</w:t>
-      </w:r>
-      <w:r>
-        <w:t xml:space="preserve">, trên Linux gõ </w:t>
-      </w:r>
-      <w:r>
-        <w:rPr>
-          <w:rFonts w:ascii="Consolas" w:eastAsia="Consolas" w:hAnsi="Consolas" w:cs="Consolas"/>
-          <w:sz w:val="21"/>
-          <w:szCs w:val="21"/>
-        </w:rPr>
-        <w:t>./server</w:t>
-      </w:r>
-      <w:r>
-        <w:t xml:space="preserve"> (tương tự với client).</w:t>
-      </w:r>
-    </w:p>
-    <w:p>
-      <w:pPr>
-        <w:keepNext/>
-        <w:spacing w:after="100" w:line="276" w:lineRule="auto"/>
-      </w:pPr>
-      <w:r>
-        <w:rPr>
-          <w:b/>
-          <w:bCs/>
-        </w:rPr>
-        <w:lastRenderedPageBreak/>
-        <w:t>Chạy trên cùng một máy:</w:t>
-      </w:r>
-      <w:r>
-        <w:t xml:space="preserve"> mở hai cửa sổ dòng lệnh, cửa sổ thứ nhất chạy </w:t>
-      </w:r>
-      <w:r>
-        <w:rPr>
-          <w:rFonts w:ascii="Consolas" w:eastAsia="Consolas" w:hAnsi="Consolas" w:cs="Consolas"/>
-          <w:sz w:val="21"/>
-          <w:szCs w:val="21"/>
-        </w:rPr>
-        <w:t>server.exe</w:t>
-      </w:r>
-      <w:r>
-        <w:t xml:space="preserve">, cửa sổ thứ hai chạy </w:t>
-      </w:r>
-      <w:r>
-        <w:rPr>
-          <w:rFonts w:ascii="Consolas" w:eastAsia="Consolas" w:hAnsi="Consolas" w:cs="Consolas"/>
-          <w:sz w:val="21"/>
-          <w:szCs w:val="21"/>
-        </w:rPr>
-        <w:t>client.exe</w:t>
-      </w:r>
-      <w:r>
-        <w:t>.</w:t>
-      </w:r>
-    </w:p>
-    <w:p>
-      <w:pPr>
-        <w:keepNext/>
-        <w:spacing w:after="100" w:line="276" w:lineRule="auto"/>
-      </w:pPr>
-      <w:r>
-        <w:t>Chạy giữa hai máy thật cùng mạng LAN hoặc Wi-Fi (ví dụ máy A 192.168.1.15, máy B 192.168.1.20):</w:t>
-      </w:r>
-    </w:p>
-    <w:p>
-      <w:pPr>
-        <w:pStyle w:val="ListParagraph"/>
-        <w:numPr>
-          <w:ilvl w:val="0"/>
-          <w:numId w:val="3"/>
-        </w:numPr>
-        <w:spacing w:after="60" w:line="276" w:lineRule="auto"/>
-        <w:jc w:val="both"/>
-      </w:pPr>
-      <w:r>
-        <w:t>Máy A chạy server: mở PowerShell trong thư mục chứa server.cpp, biên dịch bằng lệnh ở mục 8.2 hoặc dùng server.exe trong demo-windows; chạy ipconfig và lấy IPv4 của card Wi-Fi/LAN đang dùng, ví dụ 192.168.1.15. Chạy .\server.exe 8080 và giữ cửa sổ này mở.</w:t>
-      </w:r>
-    </w:p>
-    <w:p>
-      <w:pPr>
-        <w:pStyle w:val="ListParagraph"/>
-        <w:numPr>
-          <w:ilvl w:val="0"/>
-          <w:numId w:val="3"/>
-        </w:numPr>
-        <w:spacing w:after="60" w:line="276" w:lineRule="auto"/>
-        <w:jc w:val="both"/>
-      </w:pPr>
-      <w:r>
-        <w:t>Cho phép server.exe nhận kết nối TCP trên mạng Private khi Windows Firewall hỏi. Nếu không có hộp thoại và máy B không kết nối được, mở PowerShell bằng quyền Administrator trên máy A rồi chạy: New-NetFirewallRule -DisplayName "ASP demo 8080" -Direction Inbound -Action Allow -Protocol TCP -LocalPort 8080 -Profile Private. Chỉ mở đúng port đang dùng; sau buổi demo có thể xóa rule bằng Remove-NetFirewallRule -DisplayName "ASP demo 8080".</w:t>
-      </w:r>
-    </w:p>
-    <w:p>
-      <w:pPr>
-        <w:pStyle w:val="ListParagraph"/>
-        <w:numPr>
-          <w:ilvl w:val="0"/>
-          <w:numId w:val="3"/>
-        </w:numPr>
-        <w:spacing w:after="60" w:line="276" w:lineRule="auto"/>
-        <w:jc w:val="both"/>
-      </w:pPr>
-      <w:r>
-        <w:t>Máy B chạy client: biên dịch client.cpp bằng lệnh ở mục 8.2 hoặc dùng client.exe trong demo-windows nếu máy B chạy Windows. Trên PowerShell chạy Test-NetConnection 192.168.1.15 -Port 8080 để kiểm tra đường TCP, sau đó chạy .\client.exe 192.168.1.15 8080. Trên Linux dùng ./client 192.168.1.15 8080. Dùng IP máy A, không dùng 127.0.0.1 vì địa chỉ đó luôn chỉ về chính máy B.</w:t>
-      </w:r>
-    </w:p>
-    <w:p>
-      <w:pPr>
-        <w:spacing w:after="100" w:line="276" w:lineRule="auto"/>
-        <w:jc w:val="both"/>
-      </w:pPr>
-      <w:r>
-        <w:t>Server lắng nghe trên mọi địa chỉ IP của máy (</w:t>
-      </w:r>
-      <w:r>
-        <w:rPr>
-          <w:rFonts w:ascii="Consolas" w:eastAsia="Consolas" w:hAnsi="Consolas" w:cs="Consolas"/>
-          <w:sz w:val="21"/>
-          <w:szCs w:val="21"/>
-        </w:rPr>
-        <w:t>INADDR_ANY</w:t>
-      </w:r>
-      <w:r>
-        <w:t>), nên nhận được kết nối qua bất kỳ card mạng nào. Muốn kết nối qua Internet thì máy server cần có IP công khai hoặc router phải được cấu hình chuyển tiếp cổng (port forwarding). Việc này nằm ngoài phạm vi bài tập.</w:t>
-      </w:r>
-    </w:p>
-    <w:p>
-      <w:r>
-        <w:t>Có thể đổi port: trên máy A chạy .\server.exe 9090, trên máy B chạy .\client.exe 192.168.1.15 9090; nếu cần mở firewall thì thay 8080 bằng 9090. Port là tham số của hai chương trình, phải giống nhau và chưa bị ứng dụng khác chiếm. Không phải sửa mã nguồn. Cổng mặc định khi bỏ tham số là 8080.</w:t>
-      </w:r>
-    </w:p>
-    <w:p>
-      <w:r>
-        <w:t>Nếu dùng máy ảo: không cần Kali, Ubuntu cũng đủ. Chế độ Bridged cho VM một IP trong cùng LAN nên dễ demo như máy B. Với NAT, VM thường có IP riêng trong mạng ảo; kiểm tra kết nối tới IP của máy A, hoặc cấu hình chuyển tiếp cổng nếu đặt server trong VM. Dùng ip a trong Linux để xem IP; IP của VM có thể đổi sau khi khởi động lại.</w:t>
-      </w:r>
-    </w:p>
-    <w:p>
-      <w:r>
-        <w:t>Khi chụp minh chứng hai máy, nên hiện cùng lúc: trên máy A lệnh ipconfig, lệnh chạy server và log client kết nối từ IP máy B; trên máy B lệnh chạy client với IP máy A, dãy số, tổng và thông báo DUNG/SAI. Chạy thêm .\client.exe 192.168.1.15 8080 -m rồi nhập tổng sai để minh họa SAI. Ảnh chụp không nằm trong bốn tệp mà đề yêu cầu nộp; chỉ chuẩn bị nếu giảng viên yêu cầu minh chứng/demo.</w:t>
-      </w:r>
-    </w:p>
-    <w:p>
-      <w:pPr>
-        <w:pStyle w:val="Heading2"/>
-      </w:pPr>
-      <w:r>
-        <w:lastRenderedPageBreak/>
-        <w:t>8.4. Ví dụ chạy trên cùng một máy</w:t>
-      </w:r>
-    </w:p>
-    <w:p>
-      <w:pPr>
-        <w:keepNext/>
-        <w:spacing w:after="100" w:line="276" w:lineRule="auto"/>
-      </w:pPr>
-      <w:r>
-        <w:t>Bản ghi sau dùng 127.0.0.1 để minh họa thông báo của chương trình; đây không phải bằng chứng chạy trên hai máy. Màn hình server (hai phiên: một client tính tự động, một client tự nhập sai):</w:t>
-      </w:r>
-    </w:p>
-    <w:p>
-      <w:pPr>
-        <w:keepNext/>
-        <w:keepLines/>
-        <w:shd w:val="clear" w:color="auto" w:fill="F2F2F2"/>
-        <w:spacing w:before="60"/>
-        <w:ind w:left="142" w:right="142"/>
-      </w:pPr>
-      <w:r>
-        <w:rPr>
-          <w:rFonts w:ascii="Consolas" w:eastAsia="Consolas" w:hAnsi="Consolas" w:cs="Consolas"/>
-          <w:sz w:val="18"/>
-          <w:szCs w:val="18"/>
-        </w:rPr>
-        <w:t>&gt; server.exe</w:t>
-      </w:r>
-    </w:p>
-    <w:p>
-      <w:pPr>
-        <w:keepNext/>
-        <w:keepLines/>
-        <w:shd w:val="clear" w:color="auto" w:fill="F2F2F2"/>
-        <w:ind w:left="142" w:right="142"/>
-      </w:pPr>
-      <w:r>
-        <w:rPr>
-          <w:rFonts w:ascii="Consolas" w:eastAsia="Consolas" w:hAnsi="Consolas" w:cs="Consolas"/>
-          <w:sz w:val="18"/>
-          <w:szCs w:val="18"/>
-        </w:rPr>
-        <w:t>[SERVER] Dang lang nghe port 8080 tren moi dia chi IP cua may nay.</w:t>
-      </w:r>
-    </w:p>
-    <w:p>
-      <w:pPr>
-        <w:keepNext/>
-        <w:keepLines/>
-        <w:shd w:val="clear" w:color="auto" w:fill="F2F2F2"/>
-        <w:ind w:left="142" w:right="142"/>
-      </w:pPr>
-      <w:r>
-        <w:rPr>
-          <w:rFonts w:ascii="Consolas" w:eastAsia="Consolas" w:hAnsi="Consolas" w:cs="Consolas"/>
-          <w:sz w:val="18"/>
-          <w:szCs w:val="18"/>
-        </w:rPr>
-        <w:t>[SERVER] Phuc vu lan luot tung client, moi goi tin cho toi da 60 giay.</w:t>
-      </w:r>
-    </w:p>
-    <w:p>
-      <w:pPr>
-        <w:keepNext/>
-        <w:keepLines/>
-        <w:shd w:val="clear" w:color="auto" w:fill="F2F2F2"/>
-        <w:ind w:left="142" w:right="142"/>
-      </w:pPr>
-      <w:r>
-        <w:rPr>
-          <w:rFonts w:ascii="Consolas" w:eastAsia="Consolas" w:hAnsi="Consolas" w:cs="Consolas"/>
-          <w:sz w:val="18"/>
-          <w:szCs w:val="18"/>
-        </w:rPr>
-        <w:t>[SERVER] Nhan Ctrl+C de dung.</w:t>
-      </w:r>
-    </w:p>
-    <w:p>
-      <w:pPr>
-        <w:keepNext/>
-        <w:keepLines/>
-        <w:shd w:val="clear" w:color="auto" w:fill="F2F2F2"/>
-        <w:ind w:left="142" w:right="142"/>
-      </w:pPr>
-      <w:r>
-        <w:rPr>
-          <w:rFonts w:ascii="Consolas" w:eastAsia="Consolas" w:hAnsi="Consolas" w:cs="Consolas"/>
-          <w:sz w:val="18"/>
-          <w:szCs w:val="18"/>
-        </w:rPr>
-        <w:t xml:space="preserve"> </w:t>
-      </w:r>
-    </w:p>
-    <w:p>
-      <w:pPr>
-        <w:keepNext/>
-        <w:keepLines/>
-        <w:shd w:val="clear" w:color="auto" w:fill="F2F2F2"/>
-        <w:ind w:left="142" w:right="142"/>
-      </w:pPr>
-      <w:r>
-        <w:rPr>
-          <w:rFonts w:ascii="Consolas" w:eastAsia="Consolas" w:hAnsi="Consolas" w:cs="Consolas"/>
-          <w:sz w:val="18"/>
-          <w:szCs w:val="18"/>
-        </w:rPr>
-        <w:t>[SERVER] Phien #1: client 127.0.0.1:52987 da ket noi.</w:t>
-      </w:r>
-    </w:p>
-    <w:p>
-      <w:pPr>
-        <w:keepNext/>
-        <w:keepLines/>
-        <w:shd w:val="clear" w:color="auto" w:fill="F2F2F2"/>
-        <w:ind w:left="142" w:right="142"/>
-      </w:pPr>
-      <w:r>
-        <w:rPr>
-          <w:rFonts w:ascii="Consolas" w:eastAsia="Consolas" w:hAnsi="Consolas" w:cs="Consolas"/>
-          <w:sz w:val="18"/>
-          <w:szCs w:val="18"/>
-        </w:rPr>
-        <w:t>[SERVER] De bai: N = 5, day so: -2 7 -69 39 56</w:t>
-      </w:r>
-    </w:p>
-    <w:p>
-      <w:pPr>
-        <w:keepNext/>
-        <w:keepLines/>
-        <w:shd w:val="clear" w:color="auto" w:fill="F2F2F2"/>
-        <w:ind w:left="142" w:right="142"/>
-      </w:pPr>
-      <w:r>
-        <w:rPr>
-          <w:rFonts w:ascii="Consolas" w:eastAsia="Consolas" w:hAnsi="Consolas" w:cs="Consolas"/>
-          <w:sz w:val="18"/>
-          <w:szCs w:val="18"/>
-        </w:rPr>
-        <w:t>[SERVER] Tong dung: 31</w:t>
-      </w:r>
-    </w:p>
-    <w:p>
-      <w:pPr>
-        <w:keepNext/>
-        <w:keepLines/>
-        <w:shd w:val="clear" w:color="auto" w:fill="F2F2F2"/>
-        <w:ind w:left="142" w:right="142"/>
-      </w:pPr>
-      <w:r>
-        <w:rPr>
-          <w:rFonts w:ascii="Consolas" w:eastAsia="Consolas" w:hAnsi="Consolas" w:cs="Consolas"/>
-          <w:sz w:val="18"/>
-          <w:szCs w:val="18"/>
-        </w:rPr>
-        <w:t>[SERVER] Client gui tong: 31 -&gt; DUNG</w:t>
-      </w:r>
-    </w:p>
-    <w:p>
-      <w:pPr>
-        <w:keepNext/>
-        <w:keepLines/>
-        <w:shd w:val="clear" w:color="auto" w:fill="F2F2F2"/>
-        <w:ind w:left="142" w:right="142"/>
-      </w:pPr>
-      <w:r>
-        <w:rPr>
-          <w:rFonts w:ascii="Consolas" w:eastAsia="Consolas" w:hAnsi="Consolas" w:cs="Consolas"/>
-          <w:sz w:val="18"/>
-          <w:szCs w:val="18"/>
-        </w:rPr>
-        <w:t>[SERVER] Phien #1 ket thuc.</w:t>
-      </w:r>
-    </w:p>
-    <w:p>
-      <w:pPr>
-        <w:keepNext/>
-        <w:keepLines/>
-        <w:shd w:val="clear" w:color="auto" w:fill="F2F2F2"/>
-        <w:ind w:left="142" w:right="142"/>
-      </w:pPr>
-      <w:r>
-        <w:rPr>
-          <w:rFonts w:ascii="Consolas" w:eastAsia="Consolas" w:hAnsi="Consolas" w:cs="Consolas"/>
-          <w:sz w:val="18"/>
-          <w:szCs w:val="18"/>
-        </w:rPr>
-        <w:t xml:space="preserve"> </w:t>
-      </w:r>
-    </w:p>
-    <w:p>
-      <w:pPr>
-        <w:keepNext/>
-        <w:keepLines/>
-        <w:shd w:val="clear" w:color="auto" w:fill="F2F2F2"/>
-        <w:ind w:left="142" w:right="142"/>
-      </w:pPr>
-      <w:r>
-        <w:rPr>
-          <w:rFonts w:ascii="Consolas" w:eastAsia="Consolas" w:hAnsi="Consolas" w:cs="Consolas"/>
-          <w:sz w:val="18"/>
-          <w:szCs w:val="18"/>
-        </w:rPr>
-        <w:t>[SERVER] Phien #2: client 127.0.0.1:52988 da ket noi.</w:t>
-      </w:r>
-    </w:p>
-    <w:p>
-      <w:pPr>
-        <w:keepNext/>
-        <w:keepLines/>
-        <w:shd w:val="clear" w:color="auto" w:fill="F2F2F2"/>
-        <w:ind w:left="142" w:right="142"/>
-      </w:pPr>
-      <w:r>
-        <w:rPr>
-          <w:rFonts w:ascii="Consolas" w:eastAsia="Consolas" w:hAnsi="Consolas" w:cs="Consolas"/>
-          <w:sz w:val="18"/>
-          <w:szCs w:val="18"/>
-        </w:rPr>
-        <w:t>[SERVER] De bai: N = 9, day so: 1 -97 -34 -54 -78 -68 67 -12 -17</w:t>
-      </w:r>
-    </w:p>
-    <w:p>
-      <w:pPr>
-        <w:keepNext/>
-        <w:keepLines/>
-        <w:shd w:val="clear" w:color="auto" w:fill="F2F2F2"/>
-        <w:ind w:left="142" w:right="142"/>
-      </w:pPr>
-      <w:r>
-        <w:rPr>
-          <w:rFonts w:ascii="Consolas" w:eastAsia="Consolas" w:hAnsi="Consolas" w:cs="Consolas"/>
-          <w:sz w:val="18"/>
-          <w:szCs w:val="18"/>
-        </w:rPr>
-        <w:t>[SERVER] Tong dung: -292</w:t>
-      </w:r>
-    </w:p>
-    <w:p>
-      <w:pPr>
-        <w:keepNext/>
-        <w:keepLines/>
-        <w:shd w:val="clear" w:color="auto" w:fill="F2F2F2"/>
-        <w:ind w:left="142" w:right="142"/>
-      </w:pPr>
-      <w:r>
-        <w:rPr>
-          <w:rFonts w:ascii="Consolas" w:eastAsia="Consolas" w:hAnsi="Consolas" w:cs="Consolas"/>
-          <w:sz w:val="18"/>
-          <w:szCs w:val="18"/>
-        </w:rPr>
-        <w:t>[SERVER] Client gui tong: -282 -&gt; SAI</w:t>
-      </w:r>
-    </w:p>
-    <w:p>
-      <w:pPr>
-        <w:keepLines/>
-        <w:shd w:val="clear" w:color="auto" w:fill="F2F2F2"/>
-        <w:spacing w:after="180"/>
-        <w:ind w:left="142" w:right="142"/>
-      </w:pPr>
-      <w:r>
-        <w:rPr>
-          <w:rFonts w:ascii="Consolas" w:eastAsia="Consolas" w:hAnsi="Consolas" w:cs="Consolas"/>
-          <w:sz w:val="18"/>
-          <w:szCs w:val="18"/>
-        </w:rPr>
-        <w:t>[SERVER] Phien #2 ket thuc.</w:t>
-      </w:r>
-    </w:p>
-    <w:p>
-      <w:pPr>
-        <w:keepNext/>
-        <w:spacing w:after="100" w:line="276" w:lineRule="auto"/>
-      </w:pPr>
-      <w:r>
-        <w:rPr>
-          <w:b/>
-          <w:bCs/>
-        </w:rPr>
-        <w:t>Màn hình client, phiên 1</w:t>
-      </w:r>
-      <w:r>
-        <w:t xml:space="preserve"> (chương trình tự tính tổng):</w:t>
-      </w:r>
-    </w:p>
-    <w:p>
-      <w:pPr>
-        <w:keepNext/>
-        <w:keepLines/>
-        <w:shd w:val="clear" w:color="auto" w:fill="F2F2F2"/>
-        <w:spacing w:before="60"/>
-        <w:ind w:left="142" w:right="142"/>
-      </w:pPr>
-      <w:r>
-        <w:rPr>
-          <w:rFonts w:ascii="Consolas" w:eastAsia="Consolas" w:hAnsi="Consolas" w:cs="Consolas"/>
-          <w:sz w:val="18"/>
-          <w:szCs w:val="18"/>
-        </w:rPr>
-        <w:t>&gt; client.exe</w:t>
-      </w:r>
-    </w:p>
-    <w:p>
-      <w:pPr>
-        <w:keepNext/>
-        <w:keepLines/>
-        <w:shd w:val="clear" w:color="auto" w:fill="F2F2F2"/>
-        <w:ind w:left="142" w:right="142"/>
-      </w:pPr>
-      <w:r>
-        <w:rPr>
-          <w:rFonts w:ascii="Consolas" w:eastAsia="Consolas" w:hAnsi="Consolas" w:cs="Consolas"/>
-          <w:sz w:val="18"/>
-          <w:szCs w:val="18"/>
-        </w:rPr>
-        <w:t>[CLIENT] Dang ket noi toi 127.0.0.1:8080 ...</w:t>
-      </w:r>
-    </w:p>
-    <w:p>
-      <w:pPr>
-        <w:keepNext/>
-        <w:keepLines/>
-        <w:shd w:val="clear" w:color="auto" w:fill="F2F2F2"/>
-        <w:ind w:left="142" w:right="142"/>
-      </w:pPr>
-      <w:r>
-        <w:rPr>
-          <w:rFonts w:ascii="Consolas" w:eastAsia="Consolas" w:hAnsi="Consolas" w:cs="Consolas"/>
-          <w:sz w:val="18"/>
-          <w:szCs w:val="18"/>
-        </w:rPr>
-        <w:t>[CLIENT] Da ket noi.</w:t>
-      </w:r>
-    </w:p>
-    <w:p>
-      <w:pPr>
-        <w:keepNext/>
-        <w:keepLines/>
-        <w:shd w:val="clear" w:color="auto" w:fill="F2F2F2"/>
-        <w:ind w:left="142" w:right="142"/>
-      </w:pPr>
-      <w:r>
-        <w:rPr>
-          <w:rFonts w:ascii="Consolas" w:eastAsia="Consolas" w:hAnsi="Consolas" w:cs="Consolas"/>
-          <w:sz w:val="18"/>
-          <w:szCs w:val="18"/>
-        </w:rPr>
-        <w:t>[CLIENT] Nhan duoc N = 5 so: -2 7 -69 39 56</w:t>
-      </w:r>
-    </w:p>
-    <w:p>
-      <w:pPr>
-        <w:keepNext/>
-        <w:keepLines/>
-        <w:shd w:val="clear" w:color="auto" w:fill="F2F2F2"/>
-        <w:ind w:left="142" w:right="142"/>
-      </w:pPr>
-      <w:r>
-        <w:rPr>
-          <w:rFonts w:ascii="Consolas" w:eastAsia="Consolas" w:hAnsi="Consolas" w:cs="Consolas"/>
-          <w:sz w:val="18"/>
-          <w:szCs w:val="18"/>
-        </w:rPr>
-        <w:t>[CLIENT] Tong tinh duoc: 31</w:t>
-      </w:r>
-    </w:p>
-    <w:p>
-      <w:pPr>
-        <w:keepNext/>
-        <w:keepLines/>
-        <w:shd w:val="clear" w:color="auto" w:fill="F2F2F2"/>
-        <w:ind w:left="142" w:right="142"/>
-      </w:pPr>
-      <w:r>
-        <w:rPr>
-          <w:rFonts w:ascii="Consolas" w:eastAsia="Consolas" w:hAnsi="Consolas" w:cs="Consolas"/>
-          <w:sz w:val="18"/>
-          <w:szCs w:val="18"/>
-        </w:rPr>
-        <w:t>[CLIENT] Da gui tong 31 len server.</w:t>
-      </w:r>
-    </w:p>
-    <w:p>
-      <w:pPr>
-        <w:keepLines/>
-        <w:shd w:val="clear" w:color="auto" w:fill="F2F2F2"/>
-        <w:spacing w:after="180"/>
-        <w:ind w:left="142" w:right="142"/>
-      </w:pPr>
-      <w:r>
-        <w:rPr>
-          <w:rFonts w:ascii="Consolas" w:eastAsia="Consolas" w:hAnsi="Consolas" w:cs="Consolas"/>
-          <w:sz w:val="18"/>
-          <w:szCs w:val="18"/>
-        </w:rPr>
-        <w:t>[CLIENT] ===== SERVER THONG BAO: DUNG (tong dung la 31) =====</w:t>
-      </w:r>
-    </w:p>
-    <w:p>
-      <w:pPr>
-        <w:keepNext/>
-        <w:spacing w:after="100" w:line="276" w:lineRule="auto"/>
-      </w:pPr>
-      <w:r>
-        <w:rPr>
-          <w:b/>
-          <w:bCs/>
-        </w:rPr>
-        <w:t>Màn hình client, phiên 2</w:t>
-      </w:r>
-      <w:r>
-        <w:t xml:space="preserve"> (chế độ -m, người dùng gõ −282):</w:t>
-      </w:r>
-    </w:p>
-    <w:p>
-      <w:pPr>
-        <w:keepNext/>
-        <w:keepLines/>
-        <w:shd w:val="clear" w:color="auto" w:fill="F2F2F2"/>
-        <w:spacing w:before="60"/>
-        <w:ind w:left="142" w:right="142"/>
-      </w:pPr>
-      <w:r>
-        <w:rPr>
-          <w:rFonts w:ascii="Consolas" w:eastAsia="Consolas" w:hAnsi="Consolas" w:cs="Consolas"/>
-          <w:sz w:val="18"/>
-          <w:szCs w:val="18"/>
-        </w:rPr>
-        <w:t>&gt; client.exe 127.0.0.1 8080 -m</w:t>
-      </w:r>
-    </w:p>
-    <w:p>
-      <w:pPr>
-        <w:keepNext/>
-        <w:keepLines/>
-        <w:shd w:val="clear" w:color="auto" w:fill="F2F2F2"/>
-        <w:ind w:left="142" w:right="142"/>
-      </w:pPr>
-      <w:r>
-        <w:rPr>
-          <w:rFonts w:ascii="Consolas" w:eastAsia="Consolas" w:hAnsi="Consolas" w:cs="Consolas"/>
-          <w:sz w:val="18"/>
-          <w:szCs w:val="18"/>
-        </w:rPr>
-        <w:t>[CLIENT] Dang ket noi toi 127.0.0.1:8080 ...</w:t>
-      </w:r>
-    </w:p>
-    <w:p>
-      <w:pPr>
-        <w:keepNext/>
-        <w:keepLines/>
-        <w:shd w:val="clear" w:color="auto" w:fill="F2F2F2"/>
-        <w:ind w:left="142" w:right="142"/>
-      </w:pPr>
-      <w:r>
-        <w:rPr>
-          <w:rFonts w:ascii="Consolas" w:eastAsia="Consolas" w:hAnsi="Consolas" w:cs="Consolas"/>
-          <w:sz w:val="18"/>
-          <w:szCs w:val="18"/>
-        </w:rPr>
-        <w:t>[CLIENT] Da ket noi.</w:t>
-      </w:r>
-    </w:p>
-    <w:p>
-      <w:pPr>
-        <w:keepNext/>
-        <w:keepLines/>
-        <w:shd w:val="clear" w:color="auto" w:fill="F2F2F2"/>
-        <w:ind w:left="142" w:right="142"/>
-      </w:pPr>
-      <w:r>
-        <w:rPr>
-          <w:rFonts w:ascii="Consolas" w:eastAsia="Consolas" w:hAnsi="Consolas" w:cs="Consolas"/>
-          <w:sz w:val="18"/>
-          <w:szCs w:val="18"/>
-        </w:rPr>
-        <w:t>[CLIENT] Nhan duoc N = 9 so: 1 -97 -34 -54 -78 -68 67 -12 -17</w:t>
-      </w:r>
-    </w:p>
-    <w:p>
-      <w:pPr>
-        <w:keepNext/>
-        <w:keepLines/>
-        <w:shd w:val="clear" w:color="auto" w:fill="F2F2F2"/>
-        <w:ind w:left="142" w:right="142"/>
-      </w:pPr>
-      <w:r>
-        <w:rPr>
-          <w:rFonts w:ascii="Consolas" w:eastAsia="Consolas" w:hAnsi="Consolas" w:cs="Consolas"/>
-          <w:sz w:val="18"/>
-          <w:szCs w:val="18"/>
-        </w:rPr>
-        <w:t>[CLIENT] Nhap tong cua day so tren: -282</w:t>
-      </w:r>
-    </w:p>
-    <w:p>
-      <w:pPr>
-        <w:keepNext/>
-        <w:keepLines/>
-        <w:shd w:val="clear" w:color="auto" w:fill="F2F2F2"/>
-        <w:ind w:left="142" w:right="142"/>
-      </w:pPr>
-      <w:r>
-        <w:rPr>
-          <w:rFonts w:ascii="Consolas" w:eastAsia="Consolas" w:hAnsi="Consolas" w:cs="Consolas"/>
-          <w:sz w:val="18"/>
-          <w:szCs w:val="18"/>
-        </w:rPr>
-        <w:t>[CLIENT] Da gui tong -282 len server.</w:t>
-      </w:r>
-    </w:p>
-    <w:p>
-      <w:pPr>
-        <w:keepLines/>
-        <w:shd w:val="clear" w:color="auto" w:fill="F2F2F2"/>
-        <w:spacing w:after="180"/>
-        <w:ind w:left="142" w:right="142"/>
-      </w:pPr>
-      <w:r>
-        <w:rPr>
-          <w:rFonts w:ascii="Consolas" w:eastAsia="Consolas" w:hAnsi="Consolas" w:cs="Consolas"/>
-          <w:sz w:val="18"/>
-          <w:szCs w:val="18"/>
-        </w:rPr>
-        <w:t>[CLIENT] ===== SERVER THONG BAO: SAI (tong dung la -292) =====</w:t>
-      </w:r>
-    </w:p>
-    <w:p>
-      <w:pPr>
-        <w:pStyle w:val="Heading2"/>
-      </w:pPr>
-      <w:r>
-        <w:t>8.5. Lỗi thường gặp</w:t>
-      </w:r>
-    </w:p>
-    <w:tbl>
-      <w:tblPr>
-        <w:tblW w:w="9354" w:type="dxa"/>
-        <w:tblBorders>
-          <w:top w:val="single" w:sz="4" w:space="0" w:color="auto"/>
-          <w:left w:val="single" w:sz="4" w:space="0" w:color="auto"/>
-          <w:bottom w:val="single" w:sz="4" w:space="0" w:color="auto"/>
-          <w:right w:val="single" w:sz="4" w:space="0" w:color="auto"/>
-          <w:insideH w:val="single" w:sz="4" w:space="0" w:color="auto"/>
-          <w:insideV w:val="single" w:sz="4" w:space="0" w:color="auto"/>
-        </w:tblBorders>
-        <w:tblLayout w:type="fixed"/>
-        <w:tblCellMar>
-          <w:left w:w="10" w:type="dxa"/>
-          <w:right w:w="10" w:type="dxa"/>
-        </w:tblCellMar>
-        <w:tblLook w:val="04A0" w:firstRow="1" w:lastRow="0" w:firstColumn="1" w:lastColumn="0" w:noHBand="0" w:noVBand="1"/>
-      </w:tblPr>
-      <w:tblGrid>
-        <w:gridCol w:w="3741"/>
-        <w:gridCol w:w="5613"/>
-      </w:tblGrid>
-      <w:tr>
-        <w:tblPrEx>
-          <w:tblCellMar>
-            <w:top w:w="0" w:type="dxa"/>
-            <w:bottom w:w="0" w:type="dxa"/>
-          </w:tblCellMar>
-        </w:tblPrEx>
-        <w:trPr>
-          <w:cantSplit/>
-          <w:tblHeader/>
-        </w:trPr>
-        <w:tc>
-          <w:tcPr>
-            <w:tcW w:w="3741" w:type="dxa"/>
-            <w:tcBorders>
-              <w:top w:val="single" w:sz="4" w:space="0" w:color="9E9E9E"/>
-              <w:left w:val="single" w:sz="4" w:space="0" w:color="9E9E9E"/>
-              <w:bottom w:val="single" w:sz="4" w:space="0" w:color="9E9E9E"/>
-              <w:right w:val="single" w:sz="4" w:space="0" w:color="9E9E9E"/>
-            </w:tcBorders>
-            <w:shd w:val="clear" w:color="auto" w:fill="DCE6F2"/>
-            <w:tcMar>
-              <w:top w:w="40" w:type="dxa"/>
-              <w:left w:w="100" w:type="dxa"/>
-              <w:bottom w:w="40" w:type="dxa"/>
-              <w:right w:w="100" w:type="dxa"/>
-            </w:tcMar>
-          </w:tcPr>
-          <w:p>
-            <w:pPr>
-              <w:spacing w:after="20" w:line="252" w:lineRule="auto"/>
-            </w:pPr>
-            <w:r>
-              <w:rPr>
-                <w:b/>
-                <w:bCs/>
-                <w:sz w:val="22"/>
-                <w:szCs w:val="22"/>
-              </w:rPr>
-              <w:t>Thông báo</w:t>
-            </w:r>
-          </w:p>
-        </w:tc>
-        <w:tc>
-          <w:tcPr>
-            <w:tcW w:w="5613" w:type="dxa"/>
-            <w:tcBorders>
-              <w:top w:val="single" w:sz="4" w:space="0" w:color="9E9E9E"/>
-              <w:left w:val="single" w:sz="4" w:space="0" w:color="9E9E9E"/>
-              <w:bottom w:val="single" w:sz="4" w:space="0" w:color="9E9E9E"/>
-              <w:right w:val="single" w:sz="4" w:space="0" w:color="9E9E9E"/>
-            </w:tcBorders>
-            <w:shd w:val="clear" w:color="auto" w:fill="DCE6F2"/>
-            <w:tcMar>
-              <w:top w:w="40" w:type="dxa"/>
-              <w:left w:w="100" w:type="dxa"/>
-              <w:bottom w:w="40" w:type="dxa"/>
-              <w:right w:w="100" w:type="dxa"/>
-            </w:tcMar>
-          </w:tcPr>
-          <w:p>
-            <w:pPr>
-              <w:spacing w:after="20" w:line="252" w:lineRule="auto"/>
-            </w:pPr>
-            <w:r>
-              <w:rPr>
-                <w:b/>
-                <w:bCs/>
-                <w:sz w:val="22"/>
-                <w:szCs w:val="22"/>
-              </w:rPr>
-              <w:t>Nguyên nhân và cách xử lý</w:t>
-            </w:r>
-          </w:p>
-        </w:tc>
-      </w:tr>
-      <w:tr>
-        <w:tblPrEx>
-          <w:tblCellMar>
-            <w:top w:w="0" w:type="dxa"/>
-            <w:bottom w:w="0" w:type="dxa"/>
-          </w:tblCellMar>
-        </w:tblPrEx>
-        <w:trPr>
-          <w:cantSplit/>
-        </w:trPr>
-        <w:tc>
-          <w:tcPr>
-            <w:tcW w:w="3741" w:type="dxa"/>
-            <w:tcBorders>
-              <w:top w:val="single" w:sz="4" w:space="0" w:color="9E9E9E"/>
-              <w:left w:val="single" w:sz="4" w:space="0" w:color="9E9E9E"/>
-              <w:bottom w:val="single" w:sz="4" w:space="0" w:color="9E9E9E"/>
-              <w:right w:val="single" w:sz="4" w:space="0" w:color="9E9E9E"/>
-            </w:tcBorders>
-            <w:tcMar>
-              <w:top w:w="40" w:type="dxa"/>
-              <w:left w:w="100" w:type="dxa"/>
-              <w:bottom w:w="40" w:type="dxa"/>
-              <w:right w:w="100" w:type="dxa"/>
-            </w:tcMar>
-          </w:tcPr>
-          <w:p>
-            <w:pPr>
-              <w:spacing w:after="20" w:line="252" w:lineRule="auto"/>
-            </w:pPr>
-            <w:r>
-              <w:rPr>
-                <w:sz w:val="22"/>
-                <w:szCs w:val="22"/>
-              </w:rPr>
-              <w:t>Ket noi that bai</w:t>
-            </w:r>
-          </w:p>
-        </w:tc>
-        <w:tc>
-          <w:tcPr>
-            <w:tcW w:w="5613" w:type="dxa"/>
-            <w:tcBorders>
-              <w:top w:val="single" w:sz="4" w:space="0" w:color="9E9E9E"/>
-              <w:left w:val="single" w:sz="4" w:space="0" w:color="9E9E9E"/>
-              <w:bottom w:val="single" w:sz="4" w:space="0" w:color="9E9E9E"/>
-              <w:right w:val="single" w:sz="4" w:space="0" w:color="9E9E9E"/>
-            </w:tcBorders>
-            <w:tcMar>
-              <w:top w:w="40" w:type="dxa"/>
-              <w:left w:w="100" w:type="dxa"/>
-              <w:bottom w:w="40" w:type="dxa"/>
-              <w:right w:w="100" w:type="dxa"/>
-            </w:tcMar>
-          </w:tcPr>
-          <w:p>
-            <w:pPr>
-              <w:spacing w:after="20" w:line="252" w:lineRule="auto"/>
-            </w:pPr>
-            <w:r>
-              <w:rPr>
-                <w:sz w:val="22"/>
-                <w:szCs w:val="22"/>
-              </w:rPr>
-              <w:t>Server chưa chạy, sai địa chỉ hoặc port, hoặc tường lửa của máy server chặn cổng.</w:t>
-            </w:r>
-          </w:p>
-        </w:tc>
-      </w:tr>
-      <w:tr>
-        <w:tblPrEx>
-          <w:tblCellMar>
-            <w:top w:w="0" w:type="dxa"/>
-            <w:bottom w:w="0" w:type="dxa"/>
-          </w:tblCellMar>
-        </w:tblPrEx>
-        <w:trPr>
-          <w:cantSplit/>
-        </w:trPr>
-        <w:tc>
-          <w:tcPr>
-            <w:tcW w:w="3741" w:type="dxa"/>
-            <w:tcBorders>
-              <w:top w:val="single" w:sz="4" w:space="0" w:color="9E9E9E"/>
-              <w:left w:val="single" w:sz="4" w:space="0" w:color="9E9E9E"/>
-              <w:bottom w:val="single" w:sz="4" w:space="0" w:color="9E9E9E"/>
-              <w:right w:val="single" w:sz="4" w:space="0" w:color="9E9E9E"/>
-            </w:tcBorders>
-            <w:tcMar>
-              <w:top w:w="40" w:type="dxa"/>
-              <w:left w:w="100" w:type="dxa"/>
-              <w:bottom w:w="40" w:type="dxa"/>
-              <w:right w:w="100" w:type="dxa"/>
-            </w:tcMar>
-          </w:tcPr>
-          <w:p>
-            <w:pPr>
-              <w:spacing w:after="20" w:line="252" w:lineRule="auto"/>
-            </w:pPr>
-            <w:r>
-              <w:rPr>
-                <w:sz w:val="22"/>
-                <w:szCs w:val="22"/>
-              </w:rPr>
-              <w:t>Khong bind duoc port</w:t>
-            </w:r>
-          </w:p>
-        </w:tc>
-        <w:tc>
-          <w:tcPr>
-            <w:tcW w:w="5613" w:type="dxa"/>
-            <w:tcBorders>
-              <w:top w:val="single" w:sz="4" w:space="0" w:color="9E9E9E"/>
-              <w:left w:val="single" w:sz="4" w:space="0" w:color="9E9E9E"/>
-              <w:bottom w:val="single" w:sz="4" w:space="0" w:color="9E9E9E"/>
-              <w:right w:val="single" w:sz="4" w:space="0" w:color="9E9E9E"/>
-            </w:tcBorders>
-            <w:tcMar>
-              <w:top w:w="40" w:type="dxa"/>
-              <w:left w:w="100" w:type="dxa"/>
-              <w:bottom w:w="40" w:type="dxa"/>
-              <w:right w:w="100" w:type="dxa"/>
-            </w:tcMar>
-          </w:tcPr>
-          <w:p>
-            <w:pPr>
-              <w:spacing w:after="20" w:line="252" w:lineRule="auto"/>
-            </w:pPr>
-            <w:r>
-              <w:rPr>
-                <w:sz w:val="22"/>
-                <w:szCs w:val="22"/>
-              </w:rPr>
-              <w:t xml:space="preserve">Port đang bị chương trình khác dùng. Chạy server với port khác, ví dụ </w:t>
-            </w:r>
-            <w:r>
-              <w:rPr>
-                <w:rFonts w:ascii="Consolas" w:eastAsia="Consolas" w:hAnsi="Consolas" w:cs="Consolas"/>
-                <w:sz w:val="19"/>
-                <w:szCs w:val="19"/>
-              </w:rPr>
-              <w:t>server.exe 9090</w:t>
-            </w:r>
-            <w:r>
-              <w:rPr>
-                <w:sz w:val="22"/>
-                <w:szCs w:val="22"/>
-              </w:rPr>
-              <w:t xml:space="preserve">, rồi chạy </w:t>
-            </w:r>
-            <w:r>
-              <w:rPr>
-                <w:rFonts w:ascii="Consolas" w:eastAsia="Consolas" w:hAnsi="Consolas" w:cs="Consolas"/>
-                <w:sz w:val="19"/>
-                <w:szCs w:val="19"/>
-              </w:rPr>
-              <w:t>client.exe 127.0.0.1 9090</w:t>
-            </w:r>
-            <w:r>
-              <w:rPr>
-                <w:sz w:val="22"/>
-                <w:szCs w:val="22"/>
-              </w:rPr>
-              <w:t>.</w:t>
-            </w:r>
-          </w:p>
-        </w:tc>
-      </w:tr>
-      <w:tr>
-        <w:tblPrEx>
-          <w:tblCellMar>
-            <w:top w:w="0" w:type="dxa"/>
-            <w:bottom w:w="0" w:type="dxa"/>
-          </w:tblCellMar>
-        </w:tblPrEx>
-        <w:trPr>
-          <w:cantSplit/>
-        </w:trPr>
-        <w:tc>
-          <w:tcPr>
-            <w:tcW w:w="3741" w:type="dxa"/>
-            <w:tcBorders>
-              <w:top w:val="single" w:sz="4" w:space="0" w:color="9E9E9E"/>
-              <w:left w:val="single" w:sz="4" w:space="0" w:color="9E9E9E"/>
-              <w:bottom w:val="single" w:sz="4" w:space="0" w:color="9E9E9E"/>
-              <w:right w:val="single" w:sz="4" w:space="0" w:color="9E9E9E"/>
-            </w:tcBorders>
-            <w:tcMar>
-              <w:top w:w="40" w:type="dxa"/>
-              <w:left w:w="100" w:type="dxa"/>
-              <w:bottom w:w="40" w:type="dxa"/>
-              <w:right w:w="100" w:type="dxa"/>
-            </w:tcMar>
-          </w:tcPr>
-          <w:p>
-            <w:pPr>
-              <w:spacing w:after="20" w:line="252" w:lineRule="auto"/>
-            </w:pPr>
-            <w:r>
-              <w:rPr>
-                <w:sz w:val="22"/>
-                <w:szCs w:val="22"/>
-              </w:rPr>
-              <w:t>undefined reference to WSAStartup (khi biên dịch)</w:t>
-            </w:r>
-          </w:p>
-        </w:tc>
-        <w:tc>
-          <w:tcPr>
-            <w:tcW w:w="5613" w:type="dxa"/>
-            <w:tcBorders>
-              <w:top w:val="single" w:sz="4" w:space="0" w:color="9E9E9E"/>
-              <w:left w:val="single" w:sz="4" w:space="0" w:color="9E9E9E"/>
-              <w:bottom w:val="single" w:sz="4" w:space="0" w:color="9E9E9E"/>
-              <w:right w:val="single" w:sz="4" w:space="0" w:color="9E9E9E"/>
-            </w:tcBorders>
-            <w:tcMar>
-              <w:top w:w="40" w:type="dxa"/>
-              <w:left w:w="100" w:type="dxa"/>
-              <w:bottom w:w="40" w:type="dxa"/>
-              <w:right w:w="100" w:type="dxa"/>
-            </w:tcMar>
-          </w:tcPr>
-          <w:p>
-            <w:pPr>
-              <w:spacing w:after="20" w:line="252" w:lineRule="auto"/>
-            </w:pPr>
-            <w:r>
-              <w:rPr>
-                <w:sz w:val="22"/>
-                <w:szCs w:val="22"/>
-              </w:rPr>
-              <w:t xml:space="preserve">Thiếu tham số </w:t>
-            </w:r>
-            <w:r>
-              <w:rPr>
-                <w:rFonts w:ascii="Consolas" w:eastAsia="Consolas" w:hAnsi="Consolas" w:cs="Consolas"/>
-                <w:sz w:val="19"/>
-                <w:szCs w:val="19"/>
-              </w:rPr>
-              <w:t>-lws2_32</w:t>
-            </w:r>
-            <w:r>
-              <w:rPr>
-                <w:sz w:val="22"/>
-                <w:szCs w:val="22"/>
-              </w:rPr>
-              <w:t xml:space="preserve"> trong lệnh g++.</w:t>
-            </w:r>
-          </w:p>
-        </w:tc>
-      </w:tr>
-      <w:tr>
-        <w:tblPrEx>
-          <w:tblCellMar>
-            <w:top w:w="0" w:type="dxa"/>
-            <w:bottom w:w="0" w:type="dxa"/>
-          </w:tblCellMar>
-        </w:tblPrEx>
-        <w:trPr>
-          <w:cantSplit/>
-        </w:trPr>
-        <w:tc>
-          <w:tcPr>
-            <w:tcW w:w="3741" w:type="dxa"/>
-            <w:tcBorders>
-              <w:top w:val="single" w:sz="4" w:space="0" w:color="9E9E9E"/>
-              <w:left w:val="single" w:sz="4" w:space="0" w:color="9E9E9E"/>
-              <w:bottom w:val="single" w:sz="4" w:space="0" w:color="9E9E9E"/>
-              <w:right w:val="single" w:sz="4" w:space="0" w:color="9E9E9E"/>
-            </w:tcBorders>
-            <w:tcMar>
-              <w:top w:w="40" w:type="dxa"/>
-              <w:left w:w="100" w:type="dxa"/>
-              <w:bottom w:w="40" w:type="dxa"/>
-              <w:right w:w="100" w:type="dxa"/>
-            </w:tcMar>
-          </w:tcPr>
-          <w:p>
-            <w:pPr>
-              <w:spacing w:after="20" w:line="252" w:lineRule="auto"/>
-            </w:pPr>
-            <w:r>
-              <w:rPr>
-                <w:sz w:val="22"/>
-                <w:szCs w:val="22"/>
-              </w:rPr>
-              <w:t>Ben kia bao loi: Qua thoi gian cho</w:t>
-            </w:r>
-          </w:p>
-        </w:tc>
-        <w:tc>
-          <w:tcPr>
-            <w:tcW w:w="5613" w:type="dxa"/>
-            <w:tcBorders>
-              <w:top w:val="single" w:sz="4" w:space="0" w:color="9E9E9E"/>
-              <w:left w:val="single" w:sz="4" w:space="0" w:color="9E9E9E"/>
-              <w:bottom w:val="single" w:sz="4" w:space="0" w:color="9E9E9E"/>
-              <w:right w:val="single" w:sz="4" w:space="0" w:color="9E9E9E"/>
-            </w:tcBorders>
-            <w:tcMar>
-              <w:top w:w="40" w:type="dxa"/>
-              <w:left w:w="100" w:type="dxa"/>
-              <w:bottom w:w="40" w:type="dxa"/>
-              <w:right w:w="100" w:type="dxa"/>
-            </w:tcMar>
-          </w:tcPr>
-          <w:p>
-            <w:pPr>
-              <w:spacing w:after="20" w:line="252" w:lineRule="auto"/>
-            </w:pPr>
-            <w:r>
-              <w:rPr>
-                <w:sz w:val="22"/>
-                <w:szCs w:val="22"/>
-              </w:rPr>
-              <w:t>Ở chế độ -m, người dùng nhập tổng chậm hơn 60 giây. Chạy lại client để nhận đề mới.</w:t>
-            </w:r>
-          </w:p>
-        </w:tc>
-      </w:tr>
-    </w:tbl>
-    <w:p>
-      <w:pPr>
-        <w:spacing w:after="100"/>
-      </w:pPr>
+        <w:t>Khi chụp minh chứng, terminal server cần hiện kết nối từ 192.168.1.5; terminal client cần hiện lệnh tới 192.168.1.3 và kết quả ĐÚNG/SAI. Dùng ảnh từ lần chạy thật của hai máy.</w:t>
+      </w:r>
     </w:p>
     <w:sectPr>
       <w:footerReference w:type="default" r:id="rId7"/>

</xml_diff>

<commit_message>
Document two-machine terminal results
</commit_message>
<xml_diff>
--- a/protocol.docx
+++ b/protocol.docx
@@ -7698,8 +7698,334 @@
       </w:r>
     </w:p>
     <w:p>
-      <w:r>
-        <w:t>Khi chụp minh chứng, terminal server cần hiện kết nối từ 192.168.1.5; terminal client cần hiện lệnh tới 192.168.1.3 và kết quả ĐÚNG/SAI. Dùng ảnh từ lần chạy thật của hai máy.</w:t>
+      <w:pPr>
+        <w:pStyle w:val="Heading2"/>
+        <w:pageBreakBefore/>
+      </w:pPr>
+      <w:r>
+        <w:t>8.3. Kết quả terminal trên hai máy</w:t>
+      </w:r>
+    </w:p>
+    <w:p>
+      <w:r>
+        <w:t>Bản chép từ hai ảnh terminal của nhóm. IP bị che trong ảnh được điền theo thông tin nhóm cung cấp: server 192.168.1.3, client 192.168.1.5.</w:t>
+      </w:r>
+    </w:p>
+    <w:p>
+      <w:r>
+        <w:t>Máy A (Linux server):</w:t>
+      </w:r>
+    </w:p>
+    <w:p>
+      <w:pPr>
+        <w:shd w:fill="F2F2F2"/>
+      </w:pPr>
+      <w:r>
+        <w:rPr>
+          <w:rFonts w:ascii="Consolas" w:hAnsi="Consolas"/>
+          <w:sz w:val="18"/>
+        </w:rPr>
+        <w:t>potato@LAPTOP-G49VODK1:~/bt2-nhom5$ ./server 8080</w:t>
+      </w:r>
+      <w:r>
+        <w:br/>
+      </w:r>
+      <w:r>
+        <w:rPr>
+          <w:rFonts w:ascii="Consolas" w:hAnsi="Consolas"/>
+          <w:sz w:val="18"/>
+        </w:rPr>
+        <w:t>[SERVER] Dang lang nghe port 8080 tren moi dia chi IP cua may nay.</w:t>
+      </w:r>
+      <w:r>
+        <w:br/>
+      </w:r>
+      <w:r>
+        <w:rPr>
+          <w:rFonts w:ascii="Consolas" w:hAnsi="Consolas"/>
+          <w:sz w:val="18"/>
+        </w:rPr>
+        <w:t>[SERVER] Phuc vu lan luot tung client, moi goi tin cho toi da 60 giay.</w:t>
+      </w:r>
+      <w:r>
+        <w:br/>
+      </w:r>
+      <w:r>
+        <w:rPr>
+          <w:rFonts w:ascii="Consolas" w:hAnsi="Consolas"/>
+          <w:sz w:val="18"/>
+        </w:rPr>
+        <w:t>[SERVER] Nhan Ctrl+C de dung.</w:t>
+      </w:r>
+      <w:r>
+        <w:br/>
+      </w:r>
+      <w:r>
+        <w:rPr>
+          <w:rFonts w:ascii="Consolas" w:hAnsi="Consolas"/>
+          <w:sz w:val="18"/>
+        </w:rPr>
+      </w:r>
+      <w:r>
+        <w:br/>
+      </w:r>
+      <w:r>
+        <w:rPr>
+          <w:rFonts w:ascii="Consolas" w:hAnsi="Consolas"/>
+          <w:sz w:val="18"/>
+        </w:rPr>
+        <w:t>[SERVER] Phien #1: client 192.168.1.5:65031 da ket noi.</w:t>
+      </w:r>
+      <w:r>
+        <w:br/>
+      </w:r>
+      <w:r>
+        <w:rPr>
+          <w:rFonts w:ascii="Consolas" w:hAnsi="Consolas"/>
+          <w:sz w:val="18"/>
+        </w:rPr>
+        <w:t>[SERVER] De bai: N = 7, day so: -90 -61 -52 11 -90 19 -19</w:t>
+      </w:r>
+      <w:r>
+        <w:br/>
+      </w:r>
+      <w:r>
+        <w:rPr>
+          <w:rFonts w:ascii="Consolas" w:hAnsi="Consolas"/>
+          <w:sz w:val="18"/>
+        </w:rPr>
+        <w:t>[SERVER] Tong dung: -282</w:t>
+      </w:r>
+      <w:r>
+        <w:br/>
+      </w:r>
+      <w:r>
+        <w:rPr>
+          <w:rFonts w:ascii="Consolas" w:hAnsi="Consolas"/>
+          <w:sz w:val="18"/>
+        </w:rPr>
+        <w:t>[SERVER] Client gui tong: -282 -&gt; DUNG</w:t>
+      </w:r>
+      <w:r>
+        <w:br/>
+      </w:r>
+      <w:r>
+        <w:rPr>
+          <w:rFonts w:ascii="Consolas" w:hAnsi="Consolas"/>
+          <w:sz w:val="18"/>
+        </w:rPr>
+        <w:t>[SERVER] Phien #1 ket thuc.</w:t>
+      </w:r>
+      <w:r>
+        <w:br/>
+      </w:r>
+      <w:r>
+        <w:rPr>
+          <w:rFonts w:ascii="Consolas" w:hAnsi="Consolas"/>
+          <w:sz w:val="18"/>
+        </w:rPr>
+      </w:r>
+      <w:r>
+        <w:br/>
+      </w:r>
+      <w:r>
+        <w:rPr>
+          <w:rFonts w:ascii="Consolas" w:hAnsi="Consolas"/>
+          <w:sz w:val="18"/>
+        </w:rPr>
+        <w:t>[SERVER] Phien #2: client 192.168.1.5:39649 da ket noi.</w:t>
+      </w:r>
+      <w:r>
+        <w:br/>
+      </w:r>
+      <w:r>
+        <w:rPr>
+          <w:rFonts w:ascii="Consolas" w:hAnsi="Consolas"/>
+          <w:sz w:val="18"/>
+        </w:rPr>
+        <w:t>[SERVER] De bai: N = 6, day so: -77 -96 -65 -1 -19 53</w:t>
+      </w:r>
+      <w:r>
+        <w:br/>
+      </w:r>
+      <w:r>
+        <w:rPr>
+          <w:rFonts w:ascii="Consolas" w:hAnsi="Consolas"/>
+          <w:sz w:val="18"/>
+        </w:rPr>
+        <w:t>[SERVER] Tong dung: -205</w:t>
+      </w:r>
+      <w:r>
+        <w:br/>
+      </w:r>
+      <w:r>
+        <w:rPr>
+          <w:rFonts w:ascii="Consolas" w:hAnsi="Consolas"/>
+          <w:sz w:val="18"/>
+        </w:rPr>
+        <w:t>[SERVER] Client gui tong: -205 -&gt; DUNG</w:t>
+      </w:r>
+      <w:r>
+        <w:br/>
+      </w:r>
+      <w:r>
+        <w:rPr>
+          <w:rFonts w:ascii="Consolas" w:hAnsi="Consolas"/>
+          <w:sz w:val="18"/>
+        </w:rPr>
+        <w:t>[SERVER] Phien #2 ket thuc.</w:t>
+      </w:r>
+    </w:p>
+    <w:p>
+      <w:r>
+        <w:t>Máy B (Windows client):</w:t>
+      </w:r>
+    </w:p>
+    <w:p>
+      <w:pPr>
+        <w:shd w:fill="F2F2F2"/>
+      </w:pPr>
+      <w:r>
+        <w:rPr>
+          <w:rFonts w:ascii="Consolas" w:hAnsi="Consolas"/>
+          <w:sz w:val="18"/>
+        </w:rPr>
+        <w:t>PS C:\Users\LENOVO\Desktop\bt2-nhom5&gt; .\client.exe 192.168.1.3 8080</w:t>
+      </w:r>
+      <w:r>
+        <w:br/>
+      </w:r>
+      <w:r>
+        <w:rPr>
+          <w:rFonts w:ascii="Consolas" w:hAnsi="Consolas"/>
+          <w:sz w:val="18"/>
+        </w:rPr>
+        <w:t>[CLIENT] Dang ket noi toi 192.168.1.3:8080 ...</w:t>
+      </w:r>
+      <w:r>
+        <w:br/>
+      </w:r>
+      <w:r>
+        <w:rPr>
+          <w:rFonts w:ascii="Consolas" w:hAnsi="Consolas"/>
+          <w:sz w:val="18"/>
+        </w:rPr>
+        <w:t>[CLIENT] Da ket noi.</w:t>
+      </w:r>
+      <w:r>
+        <w:br/>
+      </w:r>
+      <w:r>
+        <w:rPr>
+          <w:rFonts w:ascii="Consolas" w:hAnsi="Consolas"/>
+          <w:sz w:val="18"/>
+        </w:rPr>
+        <w:t>[CLIENT] Nhan duoc N = 7 so: -90 -61 -52 11 -90 19 -19</w:t>
+      </w:r>
+      <w:r>
+        <w:br/>
+      </w:r>
+      <w:r>
+        <w:rPr>
+          <w:rFonts w:ascii="Consolas" w:hAnsi="Consolas"/>
+          <w:sz w:val="18"/>
+        </w:rPr>
+        <w:t>[CLIENT] Tong tinh duoc: -282</w:t>
+      </w:r>
+      <w:r>
+        <w:br/>
+      </w:r>
+      <w:r>
+        <w:rPr>
+          <w:rFonts w:ascii="Consolas" w:hAnsi="Consolas"/>
+          <w:sz w:val="18"/>
+        </w:rPr>
+        <w:t>[CLIENT] Da gui tong -282 len server.</w:t>
+      </w:r>
+      <w:r>
+        <w:br/>
+      </w:r>
+      <w:r>
+        <w:rPr>
+          <w:rFonts w:ascii="Consolas" w:hAnsi="Consolas"/>
+          <w:sz w:val="18"/>
+        </w:rPr>
+        <w:t>[CLIENT] ===== SERVER THONG BAO: DUNG (tong dung la -282) =====</w:t>
+      </w:r>
+      <w:r>
+        <w:br/>
+      </w:r>
+      <w:r>
+        <w:rPr>
+          <w:rFonts w:ascii="Consolas" w:hAnsi="Consolas"/>
+          <w:sz w:val="18"/>
+        </w:rPr>
+        <w:t>PS C:\Users\LENOVO\Desktop\bt2-nhom5&gt; .\client.exe 192.168.1.3 8080</w:t>
+      </w:r>
+      <w:r>
+        <w:br/>
+      </w:r>
+      <w:r>
+        <w:rPr>
+          <w:rFonts w:ascii="Consolas" w:hAnsi="Consolas"/>
+          <w:sz w:val="18"/>
+        </w:rPr>
+        <w:t>[CLIENT] Dang ket noi toi 192.168.1.3:8080 ...</w:t>
+      </w:r>
+      <w:r>
+        <w:br/>
+      </w:r>
+      <w:r>
+        <w:rPr>
+          <w:rFonts w:ascii="Consolas" w:hAnsi="Consolas"/>
+          <w:sz w:val="18"/>
+        </w:rPr>
+        <w:t>[CLIENT] Da ket noi.</w:t>
+      </w:r>
+      <w:r>
+        <w:br/>
+      </w:r>
+      <w:r>
+        <w:rPr>
+          <w:rFonts w:ascii="Consolas" w:hAnsi="Consolas"/>
+          <w:sz w:val="18"/>
+        </w:rPr>
+        <w:t>[CLIENT] Nhan duoc N = 6 so: -77 -96 -65 -1 -19 53</w:t>
+      </w:r>
+      <w:r>
+        <w:br/>
+      </w:r>
+      <w:r>
+        <w:rPr>
+          <w:rFonts w:ascii="Consolas" w:hAnsi="Consolas"/>
+          <w:sz w:val="18"/>
+        </w:rPr>
+        <w:t>[CLIENT] Tong tinh duoc: -205</w:t>
+      </w:r>
+      <w:r>
+        <w:br/>
+      </w:r>
+      <w:r>
+        <w:rPr>
+          <w:rFonts w:ascii="Consolas" w:hAnsi="Consolas"/>
+          <w:sz w:val="18"/>
+        </w:rPr>
+        <w:t>[CLIENT] Da gui tong -205 len server.</w:t>
+      </w:r>
+      <w:r>
+        <w:br/>
+      </w:r>
+      <w:r>
+        <w:rPr>
+          <w:rFonts w:ascii="Consolas" w:hAnsi="Consolas"/>
+          <w:sz w:val="18"/>
+        </w:rPr>
+        <w:t>[CLIENT] ===== SERVER THONG BAO: DUNG (tong dung la -205) =====</w:t>
+      </w:r>
+    </w:p>
+    <w:p>
+      <w:r>
+        <w:t>Port sau IP client (65031, 39649) là port tạm do hệ điều hành cấp; port server vẫn là 8080.</w:t>
       </w:r>
     </w:p>
     <w:sectPr>

</xml_diff>

<commit_message>
Correct class and submission documents
</commit_message>
<xml_diff>
--- a/protocol.docx
+++ b/protocol.docx
@@ -5490,7 +5490,7 @@
         <w:pStyle w:val="Heading1"/>
       </w:pPr>
       <w:r>
-        <w:t>7. Ví dụ một phiên thực tế</w:t>
+        <w:t>7. Ví dụ mã hóa một phiên</w:t>
       </w:r>
     </w:p>
     <w:p>
@@ -5499,7 +5499,7 @@
         <w:jc w:val="both"/>
       </w:pPr>
       <w:r>
-        <w:t>Các byte dưới đây được ghi lại khi chạy thử. Đề có N = 6 số: 86, 53, 74, −90, 11, −78; tổng đúng là 56.</w:t>
+        <w:t>Các byte dưới đây minh họa cách mã hóa một phiên. Đề có N = 6 số: 86, 53, 74, −90, 11, −78; tổng đúng là 56.</w:t>
       </w:r>
     </w:p>
     <w:tbl>

</xml_diff>